<commit_message>
Proofcheck Flour Play Greek: MINOR (20 fixes)
Co-Authored-By: Claude Opus 5.5 <noreply@anthropic.com>
Claude-Session: https://claude.ai/code/session_012Cm8JxdqzjuttdUSdkQCUg
</commit_message>
<xml_diff>
--- a/translated/corrected/Flour Play - ASSEMBLED - FORMATTED_Greek.docx
+++ b/translated/corrected/Flour Play - ASSEMBLED - FORMATTED_Greek.docx
@@ -114,7 +114,7 @@
     <w:p/>
     <w:p>
       <w:r>
-        <w:t xml:space="preserve">Η Γκρέτα έφτιαχνε το ίδιο ρολό κανέλας επί σαράντα χρόνια. Το είχε φτιάξει το πρωί μετά την κηδεία του άντρα της επειδή δεν ήξερε τι άλλο να κάνει τα χέρια της. Αυτή την εβδομάδα βγαίνει ξινό από τον φούρνο της, και το ίδιο και η επόμενη φουρνιά, και η μεθεπόμενη.</w:t>
+        <w:t xml:space="preserve">Η Γκρέτα φτιάχνει το ίδιο ρολό κανέλας εδώ και σαράντα χρόνια. Το έφτιαξε το πρωί μετά την κηδεία του άντρα της, επειδή δεν ήξερε τι άλλο να κάνει με τα χέρια της. Αυτή την εβδομάδα βγαίνει ξινό από τον φούρνο της, και το ίδιο και η επόμενη φουρνιά, και η μεθεπόμενη.</w:t>
       </w:r>
     </w:p>
     <w:p/>
@@ -148,7 +148,7 @@
     </w:p>
     <w:p>
       <w:r>
-        <w:t>Κάθε γυναίκα στον κύκλο είχε φέρει το δικό της έλατο, κι εγώ είχα φέρει τον τρόπο του Βορείου Πόλου για το δέσιμό του, που η Ολίβια ορκιζόταν να μου κλέψει πριν από τα Χριστούγεννα. Στερέωσα αργά το σύρμα στον σκελετό, ώστε να μπορούν όλες να παρακολουθούν. Μόνο τότε έπιασα την πρώτη χούφτα έλατο. Η μυρωδιά αναδύθηκε κρύα και πράσινη, αρκετά κοφτερή για να καθαρίσει το μυαλό. Γέμισε το μπροστινό δωμάτιο του Yarn Tales όπως το μαλλί του μαγαζιού δεν μπόρεσε ποτέ ακριβώς. Κάτσαμε εκεί με ρετσίνι στα δάχτυλα και έναν γυμνό σκελετό στα γόνατά μου, μία από τις επτά γυναίκες σκυμμένες πάνω στην ίδια δουλειά. Υπάρχουν χειρότεροι τρόποι να περάσεις το πρώτο ελεύθερο πρωινό του Νοεμβρίου.</w:t>
+        <w:t xml:space="preserve">Κάθε γυναίκα στον κύκλο είχε φέρει το δικό της έλατο, κι εγώ είχα φέρει τον τρόπο του Βορείου Πόλου για το δέσιμό του, που η Ολίβια ορκιζόταν να μου κλέψει πριν από τα Χριστούγεννα. Στερέωσα αργά το σύρμα στον σκελετό, ώστε να μπορούν όλες να παρακολουθούν. Μόνο τότε έπιασα την πρώτη χούφτα έλατο. Η μυρωδιά αναδύθηκε κρύα και πράσινη, αρκετά κοφτερή για να καθαρίσει το μυαλό. Γέμισε το μπροστινό δωμάτιο του Yarn Tales όπως το μαλλί του μαγαζιού δεν μπόρεσε ποτέ ακριβώς. Καθόμουν εκεί με ρετσίνι στα δάχτυλα και έναν γυμνό σκελετό στα γόνατά μου, μία από τις επτά γυναίκες σκυμμένες πάνω στην ίδια δουλειά. Υπάρχουν χειρότεροι τρόποι να περάσεις το πρώτο ελεύθερο πρωινό του Νοεμβρίου.</w:t>
       </w:r>
     </w:p>
     <w:p>
@@ -198,7 +198,7 @@
     </w:p>
     <w:p>
       <w:r>
-        <w:t>Η Ντοτ γέλασε με το κοντό, ξερό της γέλιο από την άλλη πλευρά του κύκλου, χωρίς να σηκώσει το κεφάλι από το στεφάνι της, το οποίο ήταν ήδη μισό σχεδόν μεγαλύτερο από οποιουδήποτε άλλου και διπλάσιο σε πυκνότητα.</w:t>
+        <w:t xml:space="preserve">Η Ντοτ γέλασε με το κοντό, ξερό της γέλιο από την άλλη πλευρά του κύκλου, χωρίς να σηκώσει το κεφάλι από το στεφάνι της, το οποίο ήταν ήδη μιάμιση φορά μεγαλύτερο από οποιουδήποτε άλλου και διπλάσιο σε πυκνότητα.</w:t>
       </w:r>
     </w:p>
     <w:p>
@@ -263,7 +263,7 @@
     </w:p>
     <w:p>
       <w:r>
-        <w:t xml:space="preserve">Άφησε ένα κουτί ζαχαροπλαστείου στο μέγεθος κουτιού καπέλου πάνω στο τραπέζι ανάμεσα στα κουκουνάρια και την κορδέλα, και έβαλε τις γροθιές στη μέση της για να μας επιθεωρήσει. Η Γκρέτα είχε το Holly Jolly Bakery κάτω στη λεωφόρο, και ήταν χτισμένη σαν τα ντόνατς της, στρογγυλή και πασπαλισμένη παντού. Αυτό το πρωινό υπήρχε αλεύρι σε όλη την ποδιά της που δεν είχε μπει στον κόπο να τινάξει.</w:t>
+        <w:t xml:space="preserve">Άφησε ένα κουτί αρτοποιείου στο μέγεθος κουτιού καπέλου πάνω στο τραπέζι ανάμεσα στα κουκουνάρια και την κορδέλα, και έβαλε τις γροθιές στη μέση της για να μας επιθεωρήσει. Η Γκρέτα είχε το Holly Jolly Bakery κάτω στη λεωφόρο, και ήταν χτισμένη σαν τα ντόνατς της, στρογγυλή και πασπαλισμένη παντού. Αυτό το πρωινό υπήρχε αλεύρι σε όλη την ποδιά της που δεν είχε μπει στον κόπο να τινάξει.</w:t>
       </w:r>
     </w:p>
     <w:p>
@@ -378,7 +378,7 @@
     </w:p>
     <w:p>
       <w:r>
-        <w:t xml:space="preserve">Το πάρκο βρισκόταν απέναντι από το Yarn Tales, μια φαρδιά λευκή έκταση με το μνημείο των πεσόντων κοντά στην κορυφή και τη μεγάλη φτελιά στην απέναντι άκρη. Τα σχολειοπαίδια είχαν φτιάξει μια σειρά από χιονάνθρωπους κατά μήκος του κατά τη διάρκεια του χιονιού των Αποκριών. Τρεις από αυτούς, χοντροί και στραβοί, στεφανωμένοι με ό,τι μπορούσαν να μαζέψουν τα παιδιά. Χθες, όπως είπε η Έλι, κοιτούσαν τον δρόμο, με μάτια από κάρβουνο και συντροφικοί, παρακολουθώντας την κίνηση να περνάει όπως κάνουν οι χιονάνθρωποι. Είχα περπατήσει δίπλα τους η ίδια το προηγούμενο βράδυ. Είχαν στραμμένο το πρόσωπο προς τον δρόμο.</w:t>
+        <w:t xml:space="preserve">Το πάρκο βρισκόταν απέναντι από το Yarn Tales, μια φαρδιά λευκή έκταση με το μνημείο των πεσόντων κοντά στην κορυφή και τη μεγάλη φτελιά στην απέναντι άκρη. Τα σχολειοπαίδια είχαν φτιάξει μια σειρά από χιονάνθρωπους κατά μήκος του με το χιόνι του Χάλογουιν. Τρεις από αυτούς, χοντροί και στραβοί, στεφανωμένοι με ό,τι μπορούσαν να μαζέψουν τα παιδιά. Χθες, όπως είπε η Έλι, κοιτούσαν τον δρόμο, με μάτια από κάρβουνο και συντροφικοί, παρακολουθώντας την κίνηση να περνάει όπως κάνουν οι χιονάνθρωποι. Είχα περπατήσει δίπλα τους η ίδια το προηγούμενο βράδυ. Είχαν στραμμένο το πρόσωπο προς τον δρόμο.</w:t>
       </w:r>
     </w:p>
     <w:p>
@@ -2885,7 +2885,7 @@
     </w:p>
     <w:p>
       <w:r>
-        <w:t xml:space="preserve">Ο Ντοκ Μίτσελ ήταν ο κτηνίατρος της πόλης, κάτι που σε ένα μέρος αυτού του μεγέθους τον έκανε και φαρμακοποιό της. Ένας επαρχιακός κτηνίατρος περνάει τη ζωή του ξεχωρίζοντας την καθαρή τροφή από την τροφή στην οποία έχει πιάσει μούχλα. Διατηρούσε έναν χαμηλό πάγκο κατά μήκος του πίσω τοίχου με μια ζυγαριά, ένα καμινέτο και ένα ράφι με καφέ μπουκάλια, όπου οι αγρότες έφερναν την ανησυχία τους για τα σιτηρά τους για να πάρουν απαντήσεις. Μπήκα μέσα με ένα βάζο αλεύρι αντί για ένα άρρωστο ζώο, και έναν πιγκουίνο που πήγε κατευθείαν στη σόμπα του. Δεν ανοιγόκλεισε ούτε τα μάτια του. Του είχαν φέρει και πιο παράξενα πράγματα σε εκείνον τον πάγκο.</w:t>
+        <w:t xml:space="preserve">Ο Ντοκ Μίτσελ ήταν ο κτηνίατρος της πόλης, κάτι που σε ένα μέρος αυτού του μεγέθους τον έκανε και χημικό της. Ένας επαρχιακός κτηνίατρος περνάει τη ζωή του ξεχωρίζοντας την καθαρή τροφή από την τροφή στην οποία έχει πιάσει μούχλα. Διατηρούσε έναν χαμηλό πάγκο κατά μήκος του πίσω τοίχου με μια ζυγαριά, ένα καμινέτο και ένα ράφι με καφέ μπουκάλια, όπου οι αγρότες έφερναν την ανησυχία τους για τα σιτηρά τους για να πάρουν απαντήσεις. Μπήκα μέσα με ένα βάζο αλεύρι αντί για ένα άρρωστο ζώο, και έναν πιγκουίνο που πήγε κατευθείαν στη σόμπα του. Δεν ανοιγόκλεισε ούτε τα μάτια του. Του είχαν φέρει και πιο παράξενα πράγματα σε εκείνον τον πάγκο.</w:t>
       </w:r>
     </w:p>
     <w:p>
@@ -3103,7 +3103,7 @@
     <w:p/>
     <w:p>
       <w:r>
-        <w:t xml:space="preserve">Και ήταν προσβάσιμο. Αυτό ήταν το πρόβλημα. Όχι κάποιο θησαυροφυλάκιο. Μια ξύλινη πόρτα σε ένα δημόσιο στενό που έμενε ανοιχτή τη μισή διάρκεια κάθε μαύρου πρωινού μέχρι το τούβλο. Οποιοσδήποτε ήξερε τα ωράρια ενός φούρναρη και είχε λόγο να βρίσκεται σε εκείνη την αυλή πριν από το φως μπορούσε να περπατήσει μέχρι αυτό το κατώφλι αθέατος. Μια αυλή τόσο πολυσύχναστη, όπως είχε πει ο ίδιος ο Πιτ, ήταν γεμάτη πατημασιές και καθόλου απαντήσεις. Το χιόνι γύρω από το σκαλοπάτι της Γκρέτας ήταν πατημένο σε λάσπη και ξαναπαγωμένο, μπότα πάνω σε μπότα πάνω σε μπότα, του ντελιβερά, δική της, του εκχιονιστικού, και ο Θεός ξέρει ποιανού άλλης. Εκατό πατημασιές. Καμία δεν είχε όνομα.</w:t>
+        <w:t xml:space="preserve">Και ήταν προσβάσιμο. Αυτό ήταν το πρόβλημα. Όχι κάποιο θησαυροφυλάκιο. Μια ξύλινη πόρτα σε ένα δημόσιο στενό που έμενε ανοιχτή τη μισή διάρκεια κάθε μαύρου πρωινού μέχρι το τούβλο. Οποιοσδήποτε ήξερε τα ωράρια ενός φούρναρη και είχε λόγο να βρίσκεται σε εκείνη την αυλή πριν από το φως μπορούσε να περπατήσει μέχρι αυτό το κατώφλι αθέατος. Μια αυλή τόσο πολυσύχναστη, όπως είχε πει ο ίδιος ο Πιτ, ήταν γεμάτη πατημασιές και καθόλου απαντήσεις. Το χιόνι γύρω από το σκαλοπάτι της Γκρέτας ήταν πατημένο σε λάσπη και ξαναπαγωμένο, μπότα πάνω σε μπότα πάνω σε μπότα, του ντελιβερά, δική της, του εκχιονιστικού, και ο Θεός ξέρει ποιανού άλλου. Εκατό πατημασιές. Καμία δεν είχε όνομα.</w:t>
       </w:r>
     </w:p>
     <w:p/>
@@ -3181,7 +3181,7 @@
     <w:p/>
     <w:p>
       <w:r>
-        <w:t>Άρα η πρόσβαση δεν ήταν ετυμηγορία. Ήταν μια πόρτα, και μάλιστα φαρδιά, και πάρα πολλοί τίμιοι άνθρωποι στέκονταν μέσα της κάθε πρωί χωρίς να θέλουν να κάνουν κακό σε κανενός την ψυχή.</w:t>
+        <w:t xml:space="preserve">Άρα η πρόσβαση δεν ήταν ετυμηγορία. Ήταν μια πόρτα, και μάλιστα φαρδιά, και πάρα πολλοί τίμιοι άνθρωποι στέκονταν μέσα της κάθε πρωί χωρίς να θέλουν το κακό κανενός.</w:t>
       </w:r>
     </w:p>
     <w:p/>
@@ -5001,7 +5001,7 @@
         <w:t xml:space="preserve"/>
       </w:r>
       <w:r>
-        <w:t xml:space="preserve">. Είχε φέρει τη σκούπα της Γκρέτας και είχε σκουπίσει τα γυαλιά και δεν δεχόταν ούτε λέξη ευχαριστίας, κι εγώ την είχα συγχωρήσει πριν προλάβει η </w:t>
+        <w:t xml:space="preserve">. Είχε φέρει τη σκούπα της Γκρέτας και είχε σκουπίσει τα γυαλιά και δεν δεχόταν ούτε λέξη ευχαριστίας, κι εγώ την είχα απαλλάξει πριν προλάβει η </w:t>
       </w:r>
       <w:r>
         <w:t xml:space="preserve">Ρενέ</w:t>
@@ -5180,7 +5180,7 @@
     <w:p/>
     <w:p>
       <w:r>
-        <w:t xml:space="preserve">Δεν το είχε πει σε κανέναν. Είχε σκοπό να πουλήσει το μοναδικό ωραίο πράγμα που είχε και να δώσει τα χρήματα αθόρυβα για το μέρος από το οποίο είχε παραιτηθεί. Να αφήσει να βρεθούν στα λογιστικά βιβλία ως ανώνυμη δωρεά, να μην πάρει κανένα εύσημο γι’ αυτό, να μην ευχαριστηθεί από κανέναν. Το να τον ευχαριστούν ήταν ακριβώς αυτό εναντίον του οποίου είχε ταχθεί και σκόπευε να παραμείνει, όποιο κι αν ήταν το κόστος γι' αυτόν.</w:t>
+        <w:t xml:space="preserve">Δεν το είχε πει σε κανέναν. Είχε σκοπό να πουλήσει το μοναδικό ωραίο πράγμα που είχε και να δώσει τα χρήματα αθόρυβα για το μέρος από το οποίο είχε παραιτηθεί. Να αφήσει να βρεθούν στα λογιστικά βιβλία ως ανώνυμη δωρεά, να μην πάρει κανένα εύσημο γι’ αυτό, να μην τον ευχαριστήσει κανείς. Το να τον ευχαριστούν ήταν ακριβώς αυτό εναντίον του οποίου είχε ταχθεί και σκόπευε να παραμείνει, όποιο κι αν ήταν το κόστος γι' αυτόν.</w:t>
       </w:r>
     </w:p>
     <w:p/>
@@ -5216,7 +5216,7 @@
     <w:p/>
     <w:p>
       <w:r>
-        <w:t xml:space="preserve">Δεν τον ευχαρίστησα. Μου είχε ζητήσει κάποτε, χωρίς να ζητήσει, να μην επαινείται, και δεν επρόκειτο να αλλάξω τους όρους αυτού μέσα σε ένα παγωμένο δωμάτιο τα μεσάνυχτα. Ούτε τον αθώωσα. Δεν ήταν δική μου δουλειά να το δώσω κι εκείνος δεν το είχε ζητήσει, και το λάθος που είχε κάνει τον προηγούμενο μήνα ήταν ακόμα το λάθος που είχε κάνει, καθισμένο στις αναμνήσεις των ανθρώπων εκεί που ανήκε. Αλλά έβγαλα το παλτό μου και το κρέμασα σε μια καρέκλα. Γονάτισα κάτω στο βρεγμένο πάτωμα δίπλα του και άπλωσα το χέρι για το επόμενο μουσκεμένο κουτί. Του κράτησα συντροφιά χωρίς λέξη. Ήταν το μόνο πράγμα που είχα και άξιζε να το δώσω.</w:t>
+        <w:t xml:space="preserve">Δεν τον ευχαρίστησα. Μου είχε ζητήσει κάποτε, χωρίς να ζητήσει, να μην επαινείται, και δεν επρόκειτο να αλλάξω τους όρους αυτού μέσα σε ένα παγωμένο δωμάτιο τα μεσάνυχτα. Ούτε του έδωσα άφεση. Δεν ήταν δική μου δουλειά να τη δώσω κι εκείνος δεν το είχε ζητήσει, και το λάθος που είχε κάνει τον προηγούμενο μήνα ήταν ακόμα το λάθος που είχε κάνει, καθισμένο στις αναμνήσεις των ανθρώπων εκεί που ανήκε. Αλλά έβγαλα το παλτό μου και το κρέμασα σε μια καρέκλα. Γονάτισα κάτω στο βρεγμένο πάτωμα δίπλα του και άπλωσα το χέρι για το επόμενο μουσκεμένο κουτί. Του κράτησα συντροφιά χωρίς λέξη. Ήταν το μόνο πράγμα που είχα και άξιζε να το δώσω.</w:t>
       </w:r>
     </w:p>
     <w:p/>
@@ -5495,7 +5495,7 @@
     <w:p/>
     <w:p>
       <w:r>
-        <w:t xml:space="preserve">Η Μάρθα Γκριν καθόταν στην καρέκλα δίπλα στη σόμπα με το παλτό της ακόμη κουμπωμένο, κρατώντας το κινητό της σε απόσταση χεριού και κοιτώντας το συνοφρυωμένη μέσα από τα γυαλιά της. Η Άιβι καθόταν απέναντί της κρατώντας μια κούπα και με τα δύο χέρια. Η Ολίβια ήταν πίσω από τον πάγκο και τύλιγε μια τούφα μαλλί σε κουβάρι.</w:t>
+        <w:t xml:space="preserve">Η Μάρθα Γκριν καθόταν στην καρέκλα δίπλα στη σόμπα με το παλτό της ακόμη κουμπωμένο, κρατώντας το κινητό της σε απόσταση χεριού και κοιτώντας το συνοφρυωμένη μέσα από τα γυαλιά της. Η Άιβι καθόταν απέναντί της κρατώντας μια κούπα και με τα δύο χέρια. Η Ολίβια ήταν πίσω από τον πάγκο και τύλιγε μια κούκλα μαλλί σε κουβάρι.</w:t>
       </w:r>
     </w:p>
     <w:p/>
@@ -6114,7 +6114,7 @@
     </w:p>
     <w:p>
       <w:r>
-        <w:t xml:space="preserve">«Ο Μπομπ Πέλκεϊ έτρωγε βραδινό με τα εγγόνια του», είπε η Τανάκα. «Το έψαξε στον φορητό υπολογιστή του στο τραπέζι της κουζίνας. Το Wendt’s Bakehouse έχει λογαριασμό μαζί τους εδώ και είκοσι πέντε χρόνια. Ένα τσουβάλι από την ξινή βάση τους κάθε λίγες εβδομάδες, για τη σίκαλη που έψηνε για τα πανδοχεία, μέχρι και τον Ιούνιο. Μετά τίποτα. Λέει ότι έχασε τον μεγάλο της πελάτη, ένα πανδοχείο, μέσα στο καλοκαίρι, και η σίκαλη πήγε περίπατο μαζί της». Μια σελίδα γύρισε από την πλευρά της. «Μετά ένα τσουβάλι στις είκοσι επτά Οκτωβρίου, παραδομένο στον φούρνο. Λέει ότι το δελτίο του οδηγού είναι υπογραμμένο J. Wendt. Θα πάει στο γραφείο του πρωί-πρωί και θα μου στείλει τα τιμολόγια και τα υπογεγραμμένα δελτία».</w:t>
+        <w:t xml:space="preserve">«Ο Μπομπ Πέλκεϊ έτρωγε βραδινό με τα εγγόνια του», είπε η Τανάκα. «Το έψαξε στον φορητό υπολογιστή του στο τραπέζι της κουζίνας. Το Wendt’s Bakehouse έχει λογαριασμό μαζί τους εδώ και είκοσι πέντε χρόνια. Ένα τσουβάλι από την ξινή βάση τους κάθε λίγες εβδομάδες, για τη σίκαλη που έψηνε για τα πανδοχεία, μέχρι και τον Ιούνιο. Μετά τίποτα. Λέει ότι έχασε τον μεγάλο της πελάτη, ένα πανδοχείο, μέσα στο καλοκαίρι, και η σίκαλη πήγε περίπατο μαζί του». Μια σελίδα γύρισε από την πλευρά της. «Μετά ένα τσουβάλι στις είκοσι επτά Οκτωβρίου, παραδομένο στον φούρνο. Λέει ότι το δελτίο του οδηγού είναι υπογραμμένο J. Wendt. Θα πάει στο γραφείο του πρωί-πρωί και θα μου στείλει τα τιμολόγια και τα υπογεγραμμένα δελτία».</w:t>
       </w:r>
     </w:p>
     <w:p>
@@ -6362,7 +6362,7 @@
     </w:p>
     <w:p>
       <w:r>
-        <w:t xml:space="preserve">«Και μετά, η απαγγελία κατηγορίας είναι δουλειά μου, και έρχεται έπειτα». Ένα στεγνό, ζεστό χαμόγελο ήρθε κι έφυγε στην άκρη του στόματός της. «Κάθισα στο σαλόνι της Φιόνα μαζί σου τον περασμένο μήνα. Ξέρω πώς σου αρέσει να γίνονται αυτά. Μου αρέσει κι εμένα να γίνονται έτσι».</w:t>
+        <w:t xml:space="preserve">«Και μετά, η απαγγελία κατηγορίας είναι δουλειά μου, και έρχεται έπειτα». Ένα στεγνό, ζεστό χαμόγελο ήρθε κι έφυγε στην άκρη του στόματός της. «Κάθισα στο σαλόνι της Φιόνας μαζί σου τον περασμένο μήνα. Ξέρω πώς σου αρέσει να γίνονται αυτά. Μου αρέσει κι εμένα να γίνονται έτσι».</w:t>
       </w:r>
     </w:p>
     <w:p>
@@ -6628,7 +6628,7 @@
     </w:p>
     <w:p>
       <w:r>
-        <w:t xml:space="preserve">Η Τζόις έστρεψε το χαμόγελό της στην Γκρέτα, με ένα πικρό χαμόγελο. </w:t>
+        <w:t xml:space="preserve">Η Τζόις γύρισε προς την Γκρέτα με ένα απολογητικό χαμόγελο. </w:t>
       </w:r>
     </w:p>
     <w:p>
@@ -6684,7 +6684,7 @@
     </w:p>
     <w:p>
       <w:r>
-        <w:t xml:space="preserve">«Ο Πιτ Γκαρσία την έχει βάλει στο μάτι εκείνο το μαγαζί από τότε που—»</w:t>
+        <w:t xml:space="preserve">«Ο Πιτ Γκαρσία έχει βάλει στο μάτι εκείνο το μαγαζί από τότε που—»</w:t>
       </w:r>
     </w:p>
     <w:p/>
@@ -6933,7 +6933,7 @@
     </w:p>
     <w:p>
       <w:r>
-        <w:t xml:space="preserve">«Η πίτα ήταν πάλι δική μου», είπε.</w:t>
+        <w:t xml:space="preserve">«Η πίτα ήταν, παρ’ όλα αυτά, δική μου», είπε.</w:t>
       </w:r>
     </w:p>
     <w:p/>
@@ -6968,7 +6968,7 @@
     <w:p/>
     <w:p>
       <w:r>
-        <w:t xml:space="preserve">«Θα θέλετε έναν δικηγόρο τώρα, κυρία Γουέντ», είπε, όχι χωρίς καλοσύνη. «Είναι δικαίωμά σας, και στη θέση σας θα το έκανα. Αλλά θα είμαι σαφής, ώστε να μην μπερδευτεί κανείς αργότερα. Αυτό που έχω είναι το αρχείο ενός προμηθευτή με την υπογραφή σας πάνω του, την ταύτιση από έναν χημικό, ένα κρατικό μητρώο, έναν άντρα που αναγνωρίζει το βαν σας, και δύο γυναίκες στις οποίες τηλεφώνησε το αρτοποιείο σας με παραγγελίες από ένα βιβλίο που δεν είχατε καμία δουλειά να διαβάζετε. Όλα γραμμένα. Για κανένα από αυτά δεν χρειάζεται να παραδεχτείτε τίποτα». </w:t>
+        <w:t xml:space="preserve">«Θα θέλετε έναν δικηγόρο τώρα, κυρία Γουέντ», είπε, όχι χωρίς καλοσύνη. «Είναι δικαίωμά σας, και στη θέση σας θα το έκανα. Αλλά θα είμαι σαφής, ώστε να μην μπερδευτεί κανείς αργότερα. Έχω το αρχείο ενός προμηθευτή με την υπογραφή σας πάνω του, την ταύτιση από έναν χημικό, ένα κρατικό μητρώο, έναν άντρα που αναγνωρίζει το βαν σας, και δύο γυναίκες στις οποίες τηλεφώνησε το αρτοποιείο σας με παραγγελίες από ένα βιβλίο που δεν είχατε καμία δουλειά να διαβάζετε. Όλα γραμμένα. Για κανένα από αυτά δεν χρειάζεται να παραδεχτείτε τίποτα». </w:t>
       </w:r>
     </w:p>
     <w:p>
@@ -7305,7 +7305,7 @@
     </w:p>
     <w:p>
       <w:r>
-        <w:t xml:space="preserve">Ήρθε με τον ίδιο απλό τρόπο, με την επίπεδη δερμάτινη θήκη κάτω από το μπράτσο του, με το ίδιο υπηρεσιακό παλτό. Αλλά στην πόρτα του Holly Jolly είχε έναν αέρα ανακούφισης που δεν υπήρχε την πρώτη φορά, ήταν ένας άντρας χαρούμενος επιτέλους που του είχαν αναθέσει αυτή την αποστολή. Η Τανάκα είχε πάει το βαζάκι και την ψευδή καταγγελία στην κομητεία, και οι υπάλληλοι εκεί είδαν τι έξυπνο χέρι είχε βάλει το χεράκι του στα χαρτιά τους και τα ξεμπέρδεψαν κόμπο-κόμπο. Η προσωρινή αναστολή ακυρώθηκε. Άλλωστε ήταν προγραμματισμένος να επιστρέψει εκείνη την εβδομάδα για την επανεπιθεώρησή του. Το ανταλλακτικό για τον νιπτήρα είχε έρθει εκείνο το πρωί, και ο Τομ το είχε τοποθετήσει πριν φτάσει. Τα τρία φθαρμένα σημεία στην κουζίνα της Γκρέτας ήταν οι ίδιες που είχε κάθε παλιά κουζίνα στη λεωφόρο, και δεν ήταν πια τίποτα. Ο Βάρνεϊ στάθηκε στο κατώφλι της και της το είπε, φωναχτά, με το μαγαζί μισογεμάτο από κόσμο που είχε έρθει για να το ακούσει.</w:t>
+        <w:t xml:space="preserve">Ήρθε με τον ίδιο απλό τρόπο, με την επίπεδη δερμάτινη θήκη κάτω από το μπράτσο του, με το ίδιο υπηρεσιακό παλτό. Αλλά στην πόρτα του Holly Jolly είχε έναν αέρα ανακούφισης που δεν υπήρχε την πρώτη φορά, ήταν ένας άντρας χαρούμενος επιτέλους που του είχαν αναθέσει αυτή την αποστολή. Η Τανάκα είχε πάει το βαζάκι και την ψευδή καταγγελία στην κομητεία, και οι υπάλληλοι εκεί είδαν τι έξυπνο χέρι είχε βάλει το χεράκι του στα χαρτιά τους και τα ξεμπέρδεψαν κόμπο-κόμπο. Η προσωρινή αναστολή ακυρώθηκε. Άλλωστε ήταν προγραμματισμένος να επιστρέψει εκείνη την εβδομάδα για την επανεπιθεώρησή του. Το ανταλλακτικό για τον νιπτήρα είχε έρθει εκείνο το πρωί, και ο Τομ το είχε τοποθετήσει πριν φτάσει. Τα τρία φθαρμένα σημεία στην κουζίνα της Γκρέτας ήταν τα ίδια που είχε κάθε παλιά κουζίνα στη λεωφόρο, και δεν ήταν πια τίποτα. Ο Βάρνεϊ στάθηκε στο κατώφλι της και της το είπε, φωναχτά, με το μαγαζί μισογεμάτο από κόσμο που είχε έρθει για να το ακούσει.</w:t>
       </w:r>
     </w:p>
     <w:p>
@@ -7742,7 +7742,7 @@
     </w:p>
     <w:p>
       <w:r>
-        <w:t xml:space="preserve">Είχε ζητήσει άδεια, και είχε φέρει το σχέδιο έξω κάτω από γυαλί, με τους άκαμπτους μολυβένιους ιδρυτές στη μία πλευρά και τον καφετή γραφικό χαρακτήρα της Ελίζα Φροστ στην άλλη. Το διάβασε στη συγκεντρωμένη αίθουσα με τη μετρημένη φωνή του.</w:t>
+        <w:t xml:space="preserve">Είχε ζητήσει άδεια, και είχε φέρει το σχέδιο έξω κάτω από γυαλί, με τους άκαμπτους μολυβένιους ιδρυτές στη μία πλευρά και τον καφετή γραφικό χαρακτήρα της Ελίζας Φροστ στην άλλη. Το διάβασε στη συγκεντρωμένη αίθουσα με τη μετρημένη φωνή του.</w:t>
       </w:r>
     </w:p>
     <w:p>

</xml_diff>

<commit_message>
Full proofcheck Flour Play Greek: SIGNIFICANT (52 fixes)
Co-Authored-By: Claude Opus 5.5 <noreply@anthropic.com>
Claude-Session: https://claude.ai/code/session_012Cm8JxdqzjuttdUSdkQCUg
</commit_message>
<xml_diff>
--- a/translated/corrected/Flour Play - ASSEMBLED - FORMATTED_Greek.docx
+++ b/translated/corrected/Flour Play - ASSEMBLED - FORMATTED_Greek.docx
@@ -218,7 +218,7 @@
     </w:p>
     <w:p>
       <w:r>
-        <w:t xml:space="preserve">Και η Πιπ, η οποία δεν ήταν μέλος του κύκλου αλλά θα προσβαλλόταν βαριά αν έμενε εκτός από οποιαδήποτε μέτρηση του ποιος ήταν παρών. Είχε εγκατασταθεί κάτω από το μπροστινό παράθυρο στη μοναδική λωρίδα χαμηλού ηλιακού φωτός του Νοεμβρίου, σε μια φωλιά που είχε χτίσει από ένα πεσμένο κουβάρι κόκκινου μαλλιού που η Ολίβια, όπως παρατήρησα, δεν είχε προσπαθήσει πολύ σκληρά να πάρει πίσω. Ήταν ξαπλωμένη εκεί λαμπερή και ικανοποιημένη, με το ένα μάτι μισάνοιχτο στις διαδικασίες και σε ό,τι γυάλιζε. Και υπήρχε αρκετό υλικό που γυάλιζε. Η Ολίβια είχε ένα βάζο με επιχρυσωμένα κουκουνάρια στο τραπέζι, ένα καρούλι χρυσής κορδέλας δίπλα του. Η Πιπ είχε ήδη δεχτεί παρατηρήσεις και για τα δύο. Δύο φορές.</w:t>
+        <w:t xml:space="preserve">Και η Πιπ, η οποία δεν ήταν μέλος του κύκλου αλλά θα προσβαλλόταν βαριά αν έμενε εκτός από οποιαδήποτε μέτρηση του ποιος ήταν παρών. Είχε εγκατασταθεί κάτω από το μπροστινό παράθυρο στη μοναδική λωρίδα χαμηλού ηλιακού φωτός του Νοεμβρίου, σε μια φωλιά που είχε χτίσει από ένα πεσμένο κουβάρι κόκκινου μαλλιού που η Ολίβια, όπως παρατήρησα, δεν είχε προσπαθήσει πολύ σκληρά να πάρει πίσω. Ήταν ξαπλωμένη εκεί λαμπερή και ικανοποιημένη, με το ένα μάτι μισάνοιχτο σε ό,τι γινόταν και σε ό,τι γυάλιζε. Και υπήρχε αρκετό υλικό που γυάλιζε. Η Ολίβια είχε ένα βάζο με επιχρυσωμένα κουκουνάρια στο τραπέζι, ένα καρούλι χρυσής κορδέλας δίπλα του. Η Πιπ είχε ήδη δεχτεί παρατηρήσεις και για τα δύο. Δύο φορές.</w:t>
       </w:r>
     </w:p>
     <w:p>
@@ -248,7 +248,7 @@
     </w:p>
     <w:p>
       <w:r>
-        <w:t xml:space="preserve">Μου ήρθε τότε, τοποθετώντας τα μικρά κλαδάκια το ένα πάνω στο άλλο, πόσο μακριά είχα ταξιδέψει για να κάθομαι εκεί. Όχι τα χιλιόμετρα. Ήταν πάρα πολλά, αλλά δεν εννοούσα τα χιλιόμετρα. Όχι πολύ καιρό πριν, ήμουν η νεοφερμένη στο Φροστ Φολς. Η γυναίκα από τον Βόρειο Πόλο με τον διάσημο σύζυγο και τον πιο παράξενο πιγκουίνο. Οι άνθρωποι είχαν υπάρξει ευγενικοί μαζί μου όπως μια πόλη είναι ευγενική με έναν επισκέπτη, πράγμα που σημαίνει ότι έκαναν χώρο και παρακολουθούσαν να δουν τι θα έκανα με αυτόν. Και τώρα η Ολίβια προσπαθούσε να κλέψει τον τρόπο μου να δένω ένα στεφάνι. Ο σκύλος της Μάρθας κοιμόταν δίπλα στην καρέκλα μου τόσο πρόθυμα όσο και δίπλα στη δική της. Κανείς δεν μου εξηγούσε τίποτα πια. Θεωρούνταν δεδομένο ότι ήξερα. Το είχα κερδίσει αυτό γρήγορα μέσα σε ένα δύσκολο φθινόπωρο, πάνω από έναν χαμένο σκύλο και μια χρονοκάψουλα.</w:t>
+        <w:t xml:space="preserve">Μου ήρθε τότε, τοποθετώντας τα μικρά κλαδάκια το ένα πάνω στο άλλο, πόσο μακριά είχα ταξιδέψει για να κάθομαι εκεί. Όχι τα χιλιόμετρα. Ήταν πάρα πολλά, αλλά δεν εννοούσα τα χιλιόμετρα. Όχι πολύ καιρό πριν, ήμουν η νεοφερμένη στο Φροστ Φολς. Η γυναίκα από τον Βόρειο Πόλο με τον διάσημο σύζυγο και τον πιο παράξενο πιγκουίνο. Οι άνθρωποι ήταν ευγενικοί μαζί μου όπως μια πόλη είναι ευγενική με έναν επισκέπτη, πράγμα που σημαίνει ότι έκαναν χώρο και παρακολουθούσαν να δουν τι θα έκανα με αυτόν. Και τώρα η Ολίβια προσπαθούσε να κλέψει τον τρόπο μου να δένω ένα στεφάνι. Ο σκύλος της Μάρθας κοιμόταν δίπλα στην καρέκλα μου τόσο πρόθυμα όσο και δίπλα στη δική της. Κανείς δεν μου εξηγούσε τίποτα πια. Θεωρούνταν δεδομένο ότι ήξερα. Το είχα κερδίσει αυτό γρήγορα μέσα σε ένα δύσκολο φθινόπωρο, με έναν χαμένο σκύλο και μια χρονοκάψουλα.</w:t>
       </w:r>
     </w:p>
     <w:p>
@@ -318,7 +318,7 @@
     </w:p>
     <w:p>
       <w:r>
-        <w:t xml:space="preserve">Ξεκινήσαμε τότε σοβαρά τη δουλειά, οκτώ γυναίκες, ένα κουτί κεκάκια, ένας πιγκουίνος και ένας κοιμισμένος σκύλος. Η κουβέντα πηγαινοερχόταν μέσα στη δουλειά όπως κάνει η κουβέντα του κύκλου, τα μικρά νέα ενός ολόκληρου πρωινού κρατημένα στα κενά ανάμεσα στο δέσιμο των κλαδιών. Η κόρη της Άιβι είχε μια καινούργια δουλειά στο Κονκόρντ. Η Κλερ είχε ένα άρθρο που θα δημοσιευόταν την Πέμπτη σχετικά με το πρόγραμμα των εκχιονιστικών που μας υποσχόταν ορκίζοντάς μας ότι ήταν πιο ενδιαφέρον από ό,τι ακουγόταν. Η Μάρθα είπε ότι οι μέρες μίκραιναν τόσο γρήγορα τώρα που η Έμα ερχόταν να βγάλει βόλτα τον Σνόουμπολ σχεδόν στο σκοτάδι, κι εγώ είπα να δώσεις τα φιλιά μου στο παιδί. Η Μάρθα είπε ότι η Έμα ρωτούσε πάντα για την Πιπ. Και η Πιπ, ακούγοντας το όνομά της και εκλαμβάνοντάς το σωστά ως έπαινο, φούσκωσε τα φτερά της και φάνηκε ευχαριστημένη.</w:t>
+        <w:t xml:space="preserve">Ξεκινήσαμε τότε σοβαρά τη δουλειά, οκτώ γυναίκες, ένα κουτί κεκάκια, ένας πιγκουίνος και ένας κοιμισμένος σκύλος. Η κουβέντα πηγαινοερχόταν μέσα στη δουλειά όπως κάνει η κουβέντα του κύκλου, τα μικρά νέα ενός ολόκληρου πρωινού κρατημένα στα κενά ανάμεσα στο δέσιμο των κλαδιών. Η κόρη της Άιβι είχε μια καινούργια δουλειά στο Κονκόρντ. Η Κλερ είχε ένα άρθρο που θα δημοσιευόταν την Πέμπτη σχετικά με το πρόγραμμα των εκχιονιστικών που μας υποσχόταν ορκιζόμενη ότι ήταν πιο ενδιαφέρον από ό,τι ακουγόταν. Η Μάρθα είπε ότι οι μέρες μίκραιναν τόσο γρήγορα τώρα που η Έμα ερχόταν να βγάλει βόλτα τον Σνόουμπολ σχεδόν στο σκοτάδι, κι εγώ είπα να δώσει τα φιλιά μου στο παιδί. Η Μάρθα είπε ότι η Έμα ρωτούσε πάντα για την Πιπ. Και η Πιπ, ακούγοντας το όνομά της και εκλαμβάνοντάς το σωστά ως έπαινο, φούσκωσε τα φτερά της και φάνηκε ευχαριστημένη.</w:t>
       </w:r>
     </w:p>
     <w:p>
@@ -423,7 +423,7 @@
     </w:p>
     <w:p>
       <w:r>
-        <w:t xml:space="preserve">Επειδή ήξερα τη διαφορά. Είχα ζήσει πολύ καιρό τώρα δίπλα στη μαγεία των Χριστουγέννων. Αρκετά ώστε να τη γνωρίζω στα κόκαλά μου, απλή σαν βήμα στη σκάλα μου. Αυτό δεν ήταν ένα παιδί με κρύα δάχτυλα. Η μαγεία κυκλοφορούσε ελεύθερη στο Φροστ Φολς. Ήταν ελεύθερη από τότε που φτάσαμε, ψάχνοντας για σπίτι. Ο σύζυγός μου έχτιζε ένα. Αργά και υπομονετικά στο εργαστήριό του, μια εστία για να εγκατασταθεί, και πλησίαζε λίγο πιο κοντά στη φωτιά κάθε μέρα. Αλλά δεν είχε εγκατασταθεί ακόμα. Ήταν ακόμα έξω στην πόλη τη νύχτα, αδέξια και εντελώς χωρίς κακία, κάνοντας τα μικρά αδύνατα πράγματα που κάνει η μαγεία όταν έχει περισσότερο συναίσθημα παρά μυαλό. Άλλαζε τα φώτα του φεστιβάλ από πορτοκαλί σε χρυσά. Και τώρα, απ’ ό,τι φαινόταν, γύριζε τον χιονάνθρωπο ενός παιδιού μέσα στο σκοτάδι για να κοιτάξει ό,τι κι αν είχε τραβήξει την περιπλανώμενη προσοχή του.</w:t>
+        <w:t xml:space="preserve">Επειδή ήξερα τη διαφορά. Είχα ζήσει πολύ καιρό τώρα δίπλα στη μαγεία των Χριστουγέννων. Αρκετά ώστε να τη γνωρίζω στα κόκαλά μου, απλή σαν βήμα στη σκάλα μου. Αυτό δεν ήταν ένα παιδί με κρύα δάχτυλα. Η μαγεία κυκλοφορούσε ελεύθερη στο Φροστ Φολς. Ήταν ελεύθερη από τότε που φτάσαμε, ψάχνοντας για σπίτι. Ο σύζυγός μου έχτιζε ένα. Αργά και υπομονετικά στο εργαστήριό του, μια εστία για να εγκατασταθεί, κι εκείνη πλησίαζε λίγο πιο κοντά στη φωτιά κάθε μέρα. Αλλά δεν είχε εγκατασταθεί ακόμα. Ήταν ακόμα έξω στην πόλη τη νύχτα, αδέξια και εντελώς χωρίς κακία, κάνοντας τα μικρά αδύνατα πράγματα που κάνει η μαγεία όταν έχει περισσότερο συναίσθημα παρά μυαλό. Άλλαζε τα φώτα του φεστιβάλ από πορτοκαλί σε χρυσά. Και τώρα, απ’ ό,τι φαινόταν, γύριζε τον χιονάνθρωπο ενός παιδιού μέσα στο σκοτάδι για να κοιτάξει ό,τι κι αν είχε τραβήξει την περιπλανώμενη προσοχή του.</w:t>
       </w:r>
     </w:p>
     <w:p>
@@ -478,7 +478,7 @@
     <w:p/>
     <w:p>
       <w:r>
-        <w:t>Την έπιασα από τον καρπό, απαλά, προτού προλάβει να φτάσει τα καρβέλια στη σχάρα.</w:t>
+        <w:t xml:space="preserve">Την έπιασα από τον καρπό, απαλά, προτού προλάβει να απλώσει το χέρι στα καρβέλια της σχάρας.</w:t>
       </w:r>
     </w:p>
     <w:p>
@@ -538,7 +538,7 @@
     <w:p/>
     <w:p>
       <w:r>
-        <w:t xml:space="preserve">«Οι συνταγές μου δεν αποτυγχάνουν», είπε η Γκρέτα στο πάτωμα. «Έχω φτιάξει αυτό το ρολό κανέλας δέκα χιλιάδες φορές, αν όχι περισσότερες. Το έμαθα στην κουζίνα της μητέρας μου. Θα μπορούσα να το φτιάξω με κλειστά μάτια και το ένα χέρι δεμένο πίσω από την πλάτη μου. Το έχω φτιάξει με κεφάλι καζάνι από το ποτό, το έχω φτιάξει την ώρα που μου άρχιζαν οι πόνοι της γέννας, το έφτιαξα το πρωί μετά την κηδεία του Χάρολντ επειδή δεν ήξερα τι άλλο να κάνω τα χέρια μου, και σε σαράντα χρόνια δεν έχει βγει ποτέ ούτε μία φορά από τον φούρνο μου παρά μόνο σωστό». Η φωνή της έσπασε, αλλά συνέχισε. «Και τώρα, με την Ημέρα των Ευχαριστιών να πλησιάζει, δεν μπορώ να ψήσω ούτε ένα φαγώσιμο καρβέλι ψωμί. Τα έχω ελέγξει όλα. Οι φούρνοι είναι ακριβείς, κρέμασα ένα θερμόμετρο στον καθένα. Άνοιξα καινούργιο πακέτο μαγιά. Έτριψα ολόκληρο το μαγαζί χθες το βράδυ μήπως είχε μπει κάτι χαλασμένο στον αέρα. Και σήμερα το πρωί έφτιαξα μια καθαρή παρτίδα, προσεκτικά σαν για βάφτιση, και βγήκε έτσι». Έκανε μια χειρονομία προς τον κάδο.</w:t>
+        <w:t xml:space="preserve">«Οι συνταγές μου δεν αποτυγχάνουν», είπε η Γκρέτα στο πάτωμα. «Έχω φτιάξει αυτό το ρολό κανέλας δέκα χιλιάδες φορές, αν όχι περισσότερες. Το έμαθα στην κουζίνα της μητέρας μου. Θα μπορούσα να το φτιάξω με κλειστά μάτια και το ένα χέρι δεμένο πίσω από την πλάτη μου. Το έχω φτιάξει με κεφάλι καζάνι από το ποτό, το έχω φτιάξει την ώρα που μου άρχιζαν οι πόνοι της γέννας, το έφτιαξα το πρωί μετά την κηδεία του Χάρολντ επειδή δεν ήξερα τι άλλο να κάνω με τα χέρια μου, και σε σαράντα χρόνια δεν έχει βγει ποτέ ούτε μία φορά από τον φούρνο μου παρά μόνο σωστό». Η φωνή της έσπασε, αλλά συνέχισε. «Και τώρα, με την Ημέρα των Ευχαριστιών να πλησιάζει, δεν μπορώ να ψήσω ούτε ένα φαγώσιμο καρβέλι ψωμί. Τα έχω ελέγξει όλα. Οι φούρνοι είναι ακριβείς, κρέμασα ένα θερμόμετρο στον καθένα. Άνοιξα καινούργιο πακέτο μαγιά. Έτριψα ολόκληρο το μαγαζί χθες το βράδυ μήπως είχε μπει κάτι χαλασμένο στον αέρα. Και σήμερα το πρωί έφτιαξα μια καθαρή παρτίδα, προσεκτικά σαν για βάφτιση, και βγήκε έτσι». Έκανε μια χειρονομία προς τον κάδο.</w:t>
       </w:r>
     </w:p>
     <w:p/>
@@ -755,7 +755,7 @@
     <w:p/>
     <w:p>
       <w:r>
-        <w:t xml:space="preserve">«Μόνο όσα ακούει κανείς». Η Ρενέ άνοιξε τα δροσερά της χέρια, όλο συμπάθεια. «Η πόρτα της είναι κλειστή όλο το πρωί, και οι άνθρωποι του ψωμιού λένε ότι πέρασε κακό διάστημα. Παρτίδες που χαλάνε, τέτοιες δυσάρεστες καταστάσεις. Τη λυπάμαι πραγματικά». Κούνησε το κεφάλι της. «Αν και, να σας πω, σε αυτή τη δουλειά, μόλις το όνομα μιας κουζίνας τεθεί υπό αμφισβήτηση», με κοίταξε, ειλικρινής και με ένα πικρό χαμόγελο, σαν επαγγελματίας που εξομολογείται σε φίλη, «ο κόσμος το συζητάει, έτσι δεν είναι; Δεν είναι δίκαιο, αλλά έτσι έχουν τα πράγματα. Ένας φούρνος ζει από το όνομά του. Αν αφήσεις μια αμφιβολία να τρυπώσει, είναι διάβολος να την ξαναδιώξεις». Χαμογέλασε. «Αλλά ακούστε με, να μιλάω για δουλειές ενώ ήρθατε μόνο για να πείτε ένα γεια. Ελάτε μέσα. Θέλω να δείτε τους φούρνους».</w:t>
+        <w:t xml:space="preserve">«Μόνο όσα ακούει κανείς». Η Ρενέ άνοιξε τα δροσερά της χέρια, όλο συμπάθεια. «Η πόρτα της είναι κλειστή όλο το πρωί, και οι άνθρωποι του ψωμιού λένε ότι πέρασε κακό διάστημα. Παρτίδες που χαλάνε, τέτοιες δυσάρεστες καταστάσεις. Τη λυπάμαι πραγματικά». Κούνησε το κεφάλι της. «Αν και, να σας πω, σε αυτή τη δουλειά, μόλις το όνομα μιας κουζίνας τεθεί υπό αμφισβήτηση», με κοίταξε, ειλικρινής και με ύφος λύπης, σαν επαγγελματίας που εξομολογείται σε φίλη, «ο κόσμος το συζητάει, έτσι δεν είναι; Δεν είναι δίκαιο, αλλά έτσι έχουν τα πράγματα. Ένας φούρνος ζει από το όνομά του. Αν αφήσεις μια αμφιβολία να τρυπώσει, είναι διάβολος να την ξαναδιώξεις». Χαμογέλασε. «Αλλά ακούστε με, να μιλάω για δουλειές ενώ ήρθατε μόνο για να πείτε ένα γεια. Ελάτε μέσα. Θέλω να δείτε τους φούρνους».</w:t>
       </w:r>
     </w:p>
     <w:p/>
@@ -809,7 +809,7 @@
     <w:p/>
     <w:p>
       <w:r>
-        <w:t>Ήταν εξαιρετική παρέα, δεν μπορούσα να το αρνηθώ. Μου τα έδειξε όλα, και η αγάπη της για τη δουλειά ήταν αληθινή. Ρώτησε πώς τα πηγαίναμε με τον Νικ και πώς βολευόμασταν, και θυμόταν τις απαντήσεις μου. Στην πόρτα, μου έβαλε σχεδόν με το ζόρι ένα μικρό χρυσό κουτί με financiers, ζεστά από τον φούρνο, μικρά, πυκνά κεκάκια με καβουρντισμένο βούτυρο και αμύγδαλο. Έφαγα το ένα στο πεζοδρόμιο. Ήταν εξαιρετικό, και το σκεφτόμουν σε όλη την υπόλοιπη διάρκεια της μέρας.</w:t>
+        <w:t xml:space="preserve">Ήταν εξαιρετική παρέα, δεν μπορούσα να το αρνηθώ. Μου τα έδειξε όλα, και η αγάπη της για τη δουλειά ήταν αληθινή. Ρώτησε πώς βολευόμασταν ο Νικ κι εγώ, και θυμόταν τις απαντήσεις μου. Στην πόρτα, μου έβαλε σχεδόν με το ζόρι ένα μικρό χρυσό κουτί με financiers, ζεστά από τον φούρνο, μικρά, πυκνά κεκάκια με καβουρντισμένο βούτυρο και αμύγδαλο. Έφαγα το ένα στο πεζοδρόμιο. Ήταν εξαιρετικό, και το σκεφτόμουν σε όλη την υπόλοιπη διάρκεια της μέρας.</w:t>
       </w:r>
     </w:p>
     <w:p/>
@@ -827,7 +827,7 @@
     <w:p/>
     <w:p>
       <w:r>
-        <w:t xml:space="preserve">Κουβάλησα τα υπόλοιπα financiers πίσω στο Starlight, επειδή η Κέλι άξιζε κάτι για το φιλοδώρημα. Τη βρήκα ακόμα στον πάγκο της με τον Χαλ Θόμπσον να γέρνει ακουμπισμένος σ' αυτόν, και οι δυο τους με τα κεφάλια τους κολλημένα πάνω σε ένα φύλλο χαρτί που είχε φέρει ο Χαλ.</w:t>
+        <w:t xml:space="preserve">Κουβάλησα τα υπόλοιπα financiers πίσω στο Starlight, επειδή η Κέλι άξιζε κάτι για την πληροφορία. Τη βρήκα ακόμα στον πάγκο της με τον Χαλ Θόμπσον να γέρνει ακουμπισμένος σ' αυτόν, και οι δυο τους με τα κεφάλια τους κολλημένα πάνω σε ένα φύλλο χαρτί που είχε φέρει ο Χαλ.</w:t>
       </w:r>
     </w:p>
     <w:p/>
@@ -1210,7 +1210,7 @@
     <w:p/>
     <w:p>
       <w:r>
-        <w:t xml:space="preserve">Η Άιβι επέστρεψε ανεβαίνοντας τον δρόμο μαζί με τον Τομ από το σιδηροπωλείο, φορούσε φόρμα εργασίας και κρατούσε ένα δοχείο με υγρό αφαίρεσης γκράφιτι, κι εκείνος έπιασε δουλειά στον τοίχο. Η Γκρέτα μπήκε μέσα για να δει τι είχε βρει η Ολίβια, και η Έλι κι εγώ την ακολουθήσαμε, με την Πιπ να βαδίζει προσεκτικά στην άκρη του σκαλοπατιού.</w:t>
+        <w:t xml:space="preserve">Η Άιβι επέστρεψε ανεβαίνοντας τον δρόμο μαζί με τον Τομ από το σιδηροπωλείο, που φορούσε φόρμα εργασίας και κρατούσε ένα δοχείο με υγρό αφαίρεσης γκράφιτι, κι εκείνος έπιασε δουλειά στον τοίχο. Η Γκρέτα μπήκε μέσα για να δει τι είχε βρει η Ολίβια, και η Έλι κι εγώ την ακολουθήσαμε, με την Πιπ να βαδίζει προσεκτικά στην άκρη του σκαλοπατιού.</w:t>
       </w:r>
     </w:p>
     <w:p/>
@@ -1222,7 +1222,7 @@
     <w:p/>
     <w:p>
       <w:r>
-        <w:t xml:space="preserve">Ένα βαν τράβηξε στην άκρη του δρόμου πίσω από το φορτηγάκι του Χαλ. Ήταν ένα λευκό βαν αρτοποιείου, με την επιγραφή WENDT’S BAKEHOUSE · BRIDGTON γραμμένη με καφέ γράμματα κατά μήκος του πλαισίου. Η γυναίκα που βγήκε από αυτό ήταν περίπου στην ηλικία της Γκρέτας, αδύνατη και γρήγορη, φορώντας ένα παρκά ανοιχτό πάνω από ένα λευκό σακάκι αρτοποιού. Κοίταξε το κόντρα-πλακέ, μετά τον Τομ που έτριβε τα κόκκινα γράμματα, και το στόμα της έσφιξε. Μετά περπάτησε μέσα από την ανοιχτή πόρτα.</w:t>
+        <w:t xml:space="preserve">Ένα βαν τράβηξε στην άκρη του δρόμου πίσω από το φορτηγάκι του Χαλ. Ήταν ένα λευκό βαν αρτοποιείου, με την επιγραφή WENDT’S BAKEHOUSE · BRIDGTON γραμμένη με καφέ γράμματα κατά μήκος του πλαισίου. Η γυναίκα που βγήκε από αυτό ήταν περίπου στην ηλικία της Γκρέτας, αδύνατη και γρήγορη, φορώντας ένα παρκά ανοιχτό πάνω από ένα λευκό σακάκι αρτοποιού. Κοίταξε το κόντρα-πλακέ, μετά τον Τομ που έτριβε τα κόκκινα γράμματα, και το στόμα της έσφιξε. Μετά μπήκε από την ανοιχτή πόρτα.</w:t>
       </w:r>
     </w:p>
     <w:p/>
@@ -1306,7 +1306,7 @@
     <w:p/>
     <w:p>
       <w:r>
-        <w:t xml:space="preserve">Η Γκρέτα είχε πάει στην κουζίνα για να φτιάξει τσάι για όλους, και δεν δεχόταν βοήθεια σε αυτό. Η Τζόις πήρε το σκαμπό στην άκρη του πάγκου, δίπλα στο βιβλίο παραγγελιών των Ευχαριστιών, το οποίο ήταν ανοιχτό όπως από τη Δευτέρα. Έβαλε ένα ζευγάρι γυαλιά ανάγνωσης και έβγαλε το κινητό της.</w:t>
+        <w:t xml:space="preserve">Η Γκρέτα είχε πάει στην κουζίνα για να φτιάξει τσάι για όλους, και δεν δεχόταν βοήθεια σε αυτό. Η Τζόις πήρε το σκαμπό στην άκρη του πάγκου, δίπλα στο βιβλίο παραγγελιών των Ευχαριστιών, το οποίο ήταν ανοιχτό όπως και τη Δευτέρα. Έβαλε ένα ζευγάρι γυαλιά ανάγνωσης και έβγαλε το κινητό της.</w:t>
       </w:r>
     </w:p>
     <w:p/>
@@ -1372,7 +1372,7 @@
     <w:p/>
     <w:p>
       <w:r>
-        <w:t xml:space="preserve">Η Πιπ ήταν ξανά στο τάσι και η Τζόις περίμενε μέχρι το πουλί να πηδήξει ξανά στο πεζοδρόμιο. Μετά ανέβηκε, τράβηξε το βαν και έφυγε, ανεβαίνοντας τη λεωφόρο προς την άλλη άκρη του τετραγώνου, και χάθηκε.</w:t>
+        <w:t xml:space="preserve">Η Πιπ ήταν ξανά στο τάσι και η Τζόις περίμενε μέχρι το πουλί να πηδήξει ξανά στο πεζοδρόμιο. Μετά ανέβηκε στο βαν, ξεκίνησε και έφυγε, ανεβαίνοντας τη λεωφόρο προς την άλλη άκρη του τετραγώνου, και χάθηκε.</w:t>
       </w:r>
     </w:p>
     <w:p/>
@@ -1479,7 +1479,7 @@
     </w:p>
     <w:p>
       <w:r>
-        <w:t xml:space="preserve">Και το έκαναν. Τοποθετούσα τα κλαδάκια μου, άκουσα, και δεν είπα τίποτα πίσω.</w:t>
+        <w:t xml:space="preserve">Και το έκαναν. Τοποθετούσα τα κλαδάκια μου, άκουγα και δεν έλεγα τίποτα δικό μου.</w:t>
       </w:r>
     </w:p>
     <w:p>
@@ -1509,7 +1509,7 @@
     </w:p>
     <w:p>
       <w:r>
-        <w:t xml:space="preserve">«Το αλύσοδεψε τον Ιούλιο για να μην μπορεί να μπει το αλεύρι της», είπε η Ντοτ. «Εκείνη τον κατήγγειλε στον δήμο. Κι εκείνος την κατήγγειλε με τη σειρά του για αρουραίους στους κάδους της». Έκοψε ένα σύρμα. «Αισχρό πράγμα να το λες αυτό για αρτοποιό. Το ήξερε κι ο ίδιος. Και ο Τομ λέει ότι ο Πιτ κυκλοφορεί σ’ εκείνο το στενό όλες τις ώρες τελευταία. Πριν φέξει. Μετά το κλείσιμο».</w:t>
+        <w:t xml:space="preserve">«Αλυσόδεσε την πύλη τον Ιούλιο για να μην μπορεί να μπει το αλεύρι της», είπε η Ντοτ. «Εκείνη τον κατήγγειλε στον δήμο. Κι εκείνος την κατήγγειλε με τη σειρά του για αρουραίους στους κάδους της». Έκοψε ένα σύρμα. «Αισχρό πράγμα να το λες αυτό για αρτοποιό. Το ήξερε κι ο ίδιος. Και ο Τομ λέει ότι ο Πιτ κυκλοφορεί σ’ εκείνο το στενό όλες τις ώρες τελευταία. Πριν φέξει. Μετά το κλείσιμο».</w:t>
       </w:r>
     </w:p>
     <w:p>
@@ -1701,7 +1701,7 @@
     </w:p>
     <w:p>
       <w:r>
-        <w:t xml:space="preserve">«Κυρία Κλος». Άφησε το κατσαβίδι ακριβώς πάνω στο ύφασμα και σκούπισε τα χέρια του, παρόλο που ήταν καθαρά. «Δεν άκουσα το κουδούνι. Η αρχηγός Τανάκα λέει ότι πρέπει να το κρατάω σε λειτουργία για να ξέρει ο κόσμος πότε έρχεται κάποιος, και ξεχνάω να το προσέχω». Ένα πικρό χαμόγελο στο στόμα του. «Ξεχνάω πάρα πολλούς από τους μικρούς κανόνες. Τους μαθαίνω».</w:t>
+        <w:t xml:space="preserve">«Κυρία Κλος». Άφησε το κατσαβίδι ακριβώς πάνω στο ύφασμα και σκούπισε τα χέρια του, παρόλο που ήταν καθαρά. «Δεν άκουσα το κουδούνι. Η αρχηγός Τανάκα λέει ότι πρέπει να το κρατάω σε λειτουργία για να ξέρει ο κόσμος πότε έρχεται κάποιος, και ξεχνάω να το προσέχω». Ένα απολογητικό χαμόγελο στο στόμα του. «Ξεχνάω πάρα πολλούς από τους μικρούς κανόνες. Τους μαθαίνω».</w:t>
       </w:r>
     </w:p>
     <w:p>
@@ -1731,7 +1731,7 @@
     </w:p>
     <w:p>
       <w:r>
-        <w:t xml:space="preserve">«Η αρχηγός Τανάκα μού ανέθεσε να τα βάλω ξανά σε τάξη», είπε. «Υπό το βλέμμα το δικό της και του συμβουλίου. Κάνω τις πιο ταπεινές δουλειές και ζητάω άδεια για τις υπόλοιπες». Δεν είχε αποκατασταθεί, και τίποτα από όσα είπε όλο το πρωί δεν άφηνε να εννοηθεί ότι το περίμενε. Όταν ήθελε ένα κουτί κάτω από το ψηλό ράφι, μου ζητούσε να είμαι μάρτυρας ότι το είχε καταγράψει πρώτα στο κατάστιχο. Έγραφε το όνομά του στη στήλη με την εσκεμμένη προσοχή ενός ανθρώπου που ήξερε ότι το όνομά του σε ένα κατάστιχο δεν ήταν πια το απλό πράγμα που ήταν κάποτε.</w:t>
+        <w:t xml:space="preserve">«Η αρχηγός Τανάκα μού ανέθεσε να τα βάλω ξανά σε τάξη», είπε. «Υπό το βλέμμα το δικό της και του συμβουλίου. Κάνω τις πιο ταπεινές δουλειές και ζητάω άδεια για τις υπόλοιπες». Δεν είχε αποκατασταθεί, και τίποτα από όσα είπε όλο το πρωί δεν άφηνε να εννοηθεί ότι το περίμενε. Όταν ήθελε να κατεβάσει ένα κουτί από το ψηλό ράφι, μου ζητούσε να είμαι μάρτυρας ότι το είχε καταγράψει πρώτα στο κατάστιχο. Έγραφε το όνομά του στη στήλη με την εσκεμμένη προσοχή ενός ανθρώπου που ήξερε ότι το όνομά του σε ένα κατάστιχο δεν ήταν πια το απλό πράγμα που ήταν κάποτε.</w:t>
       </w:r>
     </w:p>
     <w:p>
@@ -1814,7 +1814,7 @@
     </w:p>
     <w:p>
       <w:r>
-        <w:t>Έβαλε το σχέδιο στον δίσκο του, και κανένας μας δεν είπε τίποτα για μια στιγμή, και μέσα σε εκείνη τη σιωπή συνειδητοποίησα ξανά ολόκληρη την κρύα μπροστινή αίθουσα γύρω μας. Πίσω μας, στο μπροστινό παράθυρο όπου η Εταιρεία τού είχε δώσει τη θέση τιμής, στεκόταν η χάλκινη κάψουλα του χρόνου.</w:t>
+        <w:t xml:space="preserve">Έβαλε το σχέδιο στον δίσκο του, και κανένας μας δεν είπε τίποτα για μια στιγμή, και μέσα σε εκείνη τη σιωπή συνειδητοποίησα ξανά ολόκληρη την κρύα μπροστινή αίθουσα γύρω μας. Πίσω μας, στο μπροστινό παράθυρο όπου η Εταιρεία τού είχε δώσει τη θέση τιμής, στεκόταν η χάλκινη χρονοκάψουλα.</w:t>
       </w:r>
     </w:p>
     <w:p>
@@ -2233,7 +2233,7 @@
     </w:p>
     <w:p>
       <w:r>
-        <w:t xml:space="preserve">Έτσι, όλοι στη λεωφόρο κατέληξαν σε αυτό. Κάποια σκανδαλιά παιδιών. Κάποιο κόλπο από το λιώσιμο. Και δεν ήταν θαύμα, και ήταν καλύτερα να μην το σκέφτεται κανείς πάρα πολύ, και είχε φέρει κανείς καφέ; Η Κέλι είχε. Ανέβηκε από το Starlight με μια μεγάλη κανάτα καφέ και τον μοίραζε σαν στρατηγός που εφοδιάζει έναν απορώντα στρατό. Όλο το σκηνικό πήρε τη μορφή μικρού φεστιβάλ. Γείτονες έξω στο κρύο, με παλτό πάνω από τα νυχτικά τους.</w:t>
+        <w:t xml:space="preserve">Έτσι, όλοι στη λεωφόρο κατέληξαν σε αυτό. Κάποια σκανδαλιά παιδιών. Κάποιο κόλπο από το λιώσιμο. Και τι θαύμα που ήταν, και ήταν καλύτερα να μην το σκέφτεται κανείς πάρα πολύ, και είχε φέρει κανείς καφέ; Η Κέλι είχε. Ανέβηκε από το Starlight με μια μεγάλη κανάτα καφέ και τον μοίραζε σαν στρατηγός που εφοδιάζει έναν απορώντα στρατό. Όλο το σκηνικό πήρε τη μορφή μικρού φεστιβάλ. Γείτονες έξω στο κρύο, με παλτό πάνω από τα νυχτικά τους.</w:t>
       </w:r>
     </w:p>
     <w:p>
@@ -2291,7 +2291,7 @@
     </w:p>
     <w:p>
       <w:r>
-        <w:t>«Το ξέρω». Το είπε απαλά, χωρίς καμία έκπληξη μέσα του, μόνο με εκείνη την πικρή τρυφερότητα που μπορεί να έχει ένας άντρας για ένα παιδί που έκανε κάτι που είναι ταυτόχρονα τεράστιος μπελάς και αδύνατον να του κρατήσεις κακία. «Το ένιωσα να περνάει τη νύχτα. Σαν ένα ζεστό ρεύμα κάτω από την πόρτα που δεν θα έπρεπε να είναι εκεί». Με τράβηξε προς το τζάκι στη μέση του δωματίου. «Έλα να σταθείς εδώ δίπλα. Θα το νιώσεις κι εσύ, τώρα που το ψάχνεις».</w:t>
+        <w:t xml:space="preserve">«Το ξέρω». Το είπε απαλά, χωρίς καμία έκπληξη μέσα του, μόνο με εκείνη την ανεκτική, μισοαπελπισμένη τρυφερότητα που μπορεί να έχει ένας άντρας για ένα παιδί που έκανε κάτι που είναι ταυτόχρονα τεράστιος μπελάς και αδύνατον να του κρατήσεις κακία. «Το ένιωσα να περνάει τη νύχτα. Σαν ένα ζεστό ρεύμα κάτω από την πόρτα που δεν θα έπρεπε να είναι εκεί». Με τράβηξε προς το τζάκι στη μέση του δωματίου. «Έλα να σταθείς εδώ δίπλα. Θα το νιώσεις κι εσύ, τώρα που το ψάχνεις».</w:t>
       </w:r>
     </w:p>
     <w:p>
@@ -2369,7 +2369,7 @@
     <w:p/>
     <w:p>
       <w:r>
-        <w:t xml:space="preserve">Η Γκρέτα πήρε πίσω το παράθυρό της τρεις μέρες μετά το τούβλο, γυαλί και χρυσά γράμματα μαζί, με την επιγραφή HOLLY JOLLY BAKERY να σχηματίζεται ολόκληρη ξανά στην πρόσοψη από τον Τομ του σιδηροπωλείου. Άνοιξε τις πόρτες της το ίδιο πρωί με μια πελατεία τόση που παραλίγο να την κάνει να κλάψει. Οι φούρνοι της είχαν φτιάξει τόσο παράξενα όσο είχαν χαλάσει. Από την ιστορία με το τούβλο είχε την πίσω πόρτα της μανταλωμένη καθώς έψηνε, είτε είχε ζέστη στην κουζίνα είτε όχι, και κάθε φουρνιά από τότε έβγαινε γλυκιά. Στεκόταν πίσω από τη διορθωμένη βιτρίνα της, αλευρωμένη και φωτισμένη σαν λυχνάρι. Πουλούσε μπισκότα τζίντζερ σε μια ουρά που έφτανε έξω από την πόρτα και έλεγε σε όλους δυνατά πως ποτέ δεν είχε αμφισβητήσει τη σεζόν ούτε για ένα λεπτό. Ήταν ψέμα. Ένα ωραίο ψέμα, και όλοι στον δρόμο της το συγχώρησαν.</w:t>
+        <w:t xml:space="preserve">Η Γκρέτα πήρε πίσω το παράθυρό της τρεις μέρες μετά το τούβλο, γυαλί και χρυσά γράμματα μαζί, με την επιγραφή HOLLY JOLLY BAKERY να σχηματίζεται ολόκληρη ξανά στην πρόσοψη από τον Τομ του σιδηροπωλείου. Άνοιξε τις πόρτες της το ίδιο πρωί με μια πελατεία τόση που παραλίγο να την κάνει να κλάψει. Οι φούρνοι της είχαν φτιάξει τόσο παράξενα όσο είχαν χαλάσει. Από την ιστορία με το τούβλο είχε την πίσω πόρτα της μανταλωμένη καθώς έψηνε, είτε είχε ζέστη στην κουζίνα είτε όχι, και κάθε φουρνιά από τότε έβγαινε γλυκιά. Στεκόταν πίσω από τη διορθωμένη βιτρίνα της, αλευρωμένη και φωτισμένη σαν λυχνάρι. Πουλούσε μπισκότα τζίντζερ σε μια ουρά που έφτανε έξω από την πόρτα και έλεγε σε όλους δυνατά πως ποτέ δεν είχε αμφισβητήσει τη σεζόν ούτε για ένα λεπτό. Ήταν ψέμα. Ένα ωραίο ψέμα, και όλοι στον δρόμο τής το χάρισαν.</w:t>
       </w:r>
     </w:p>
     <w:p/>
@@ -2399,7 +2399,7 @@
     <w:p/>
     <w:p>
       <w:r>
-        <w:t xml:space="preserve">Είχα δει πάρα πολλά πρόσωπα να δέχονται πάρα πολλά χτυπήματα, και είδα το πρόσωπο της Γκρέτας να δέχεται εκείνο. Το φως δεν έσβησε απότομα. Έσβησε όπως η παγωνιά πιάνει το παράθυρο, από τις άκρες προς τα μέσα, έτσι ώστε για μια ολόκληρη τρομερή στιγμή χαμογελούσε ακόμα μισή μέσα από ένα πρόσωπο του οποίου οι γωνίες έδειχναν ήδη τι ερχόταν. Η ουρά πίσω μου είχε απομείνει ακίνητη.</w:t>
+        <w:t xml:space="preserve">Είχα δει πάρα πολλά πρόσωπα να δέχονται πάρα πολλά χτυπήματα, και είδα το πρόσωπο της Γκρέτας να δέχεται εκείνο. Το φως δεν έσβησε απότομα. Έσβησε όπως η παγωνιά πιάνει το παράθυρο, από τις άκρες προς τα μέσα, έτσι ώστε για μια ολόκληρη τρομερή στιγμή μισοχαμογελούσε ακόμα μέσα από ένα πρόσωπο του οποίου οι γωνίες έδειχναν ήδη τι ερχόταν. Η ουρά πίσω μου είχε απομείνει ακίνητη.</w:t>
       </w:r>
     </w:p>
     <w:p/>
@@ -2709,7 +2709,7 @@
     </w:p>
     <w:p>
       <w:r>
-        <w:t xml:space="preserve">Μου το έδωσε, κι ανέβηκα τον λόφο κουβαλώντας το προτού προλάβω να μεταπειστώ και να το αναβάλω. Οι Ντουσέτ έμεναν στην άκρη κοντά στην εκκλησία, εκεί όπου η λεωφόρος έπαυε να έχει μαγαζιά και γινόταν κατοικημένη περιοχή. Ένα στενό, γκρίζο σπίτι με γερμένη βεράντα και ένα σφεντάμι γυμνό από φύλλα στην αυλή. Το αναγνώρισα ότι ήταν δικό τους πριν καν διαβάσω το όνομα πάνω στο κουτί, εξαιτίας της στοίβας με τα ξύλα. Ήταν πολύ λίγα τα ξύλα. Μια οικογένεια που σκοπεύει να βγάλει έναν χειμώνα στη Νέα Αγγλία στοιβάζει τα ξύλα της ως τα γείσα από τον Νοέμβριο. Η στοίβα των Ντουσέτ ήταν ένα χαμηλό, αξιολύπητο πράγμα σκεπασμένο με μουσαμά. Ίσα για δύο εβδομάδες καύσης, εκεί που έπρεπε να φτάνουν για τέσσερις μήνες. Και ήδη ψαγμένη από αυτόν τον μήνα για ό,τι καιγόταν.</w:t>
+        <w:t xml:space="preserve">Μου το έδωσε, κι ανέβηκα τον λόφο κουβαλώντας το προτού προλάβω να μεταπειστώ και να το αναβάλω. Οι Ντουσέτ έμεναν στην άκρη κοντά στην εκκλησία, εκεί όπου η λεωφόρος έπαυε να έχει μαγαζιά και γινόταν κατοικημένη περιοχή. Ένα στενό, γκρίζο σπίτι με γερμένη βεράντα και ένα σφεντάμι γυμνό από φύλλα στην αυλή. Το αναγνώρισα ότι ήταν δικό τους πριν καν διαβάσω το όνομα πάνω στο κουτί, εξαιτίας της στοίβας με τα ξύλα. Ήταν πολύ λίγα τα ξύλα. Μια οικογένεια που σκοπεύει να βγάλει έναν χειμώνα στη Νέα Αγγλία στοιβάζει τα ξύλα της ως τα γείσα από τον Νοέμβριο. Η στοίβα των Ντουσέτ ήταν ένα χαμηλό, αξιολύπητο πράγμα σκεπασμένο με μουσαμά. Ίσα για δύο εβδομάδες καύσης, εκεί που έπρεπε να φτάνουν για τέσσερις μήνες. Και ψαγμένη ήδη μία φορά μέσα στον μήνα για ό,τι καιγόταν.</w:t>
       </w:r>
     </w:p>
     <w:p>
@@ -2932,7 +2932,7 @@
     </w:p>
     <w:p>
       <w:r>
-        <w:t xml:space="preserve">«Δεν είπα ότι δεν υπάρχει τίποτα κακό. Είπα ότι το αλεύρι δεν έχει τίποτα». Γύρισε το βάζο στο φως. «Υπάρχει κάτι μέσα του. Κάτι που δεν είναι αλεύρι. Είναι αναμεμειγμένο παντού, λεπτό και ομοιόμορφα, και αυτό είναι που ξινίζει τα ψησίματά της, επειδή δεν κάνει απολύτως τίποτα στεγνό σε έναν κάδο και τα κάνει όλα μόλις βραχεί. Ανακατεύεις μια ζύμη με αυτό μέσα και ξινίζει ολόκληρη η παρτίδα, και ο φούρνος σπρώχνει αυτή την κομμένη άκρη πάνω από την ψίχα και πάνω στη γλώσσα. Γι' αυτό το κυνήγησε μέσα από τέσσερις καθαρές παρτίδες και ένα νέο σακί μαγιάς και δεν το έπιασε ποτέ. Έψαχνε για κακό συστατικό. Αυτό δεν είναι κακό συστατικό. Είναι προσθήκη».</w:t>
+        <w:t xml:space="preserve">«Δεν είπα ότι δεν υπάρχει τίποτα κακό. Είπα ότι το αλεύρι δεν έχει τίποτα». Γύρισε το βάζο στο φως. «Υπάρχει κάτι μέσα του. Κάτι που δεν είναι αλεύρι. Είναι αναμεμειγμένο παντού, λεπτό και ομοιόμορφα, και αυτό είναι που ξινίζει τα ψησίματά της, επειδή δεν κάνει απολύτως τίποτα στεγνό σε έναν κάδο και τα κάνει όλα μόλις βραχεί. Ανακατεύεις μια ζύμη με αυτό μέσα και ξινίζει ολόκληρη η παρτίδα, και ο φούρνος σπρώχνει αυτή την κομμένη άκρη μέσα από την ψίχα και πάνω στη γλώσσα. Γι' αυτό το κυνήγησε μέσα από τέσσερις καθαρές παρτίδες και ένα νέο σακί μαγιάς και δεν το έπιασε ποτέ. Έψαχνε για κακό συστατικό. Αυτό δεν είναι κακό συστατικό. Είναι προσθήκη».</w:t>
       </w:r>
     </w:p>
     <w:p>
@@ -2974,7 +2974,7 @@
     </w:p>
     <w:p>
       <w:r>
-        <w:t xml:space="preserve">Δεν μπορούσες να αγοράσεις μια ξινή βάση με το σακί από το ράφι ενός μπακάλη. Ερχόταν από προμηθευτή αρτοποιών, με ανοιχτό λογαριασμό, σε ανθρώπους γνωστούς στον χώρο. Ούτε μπορούσες να τη δοσολογήσεις με το μάτι. Μια πρέζα λιγότερο και δεν έπιανε. Μια φτυαριά παραπάνω και το ωμό αλεύρι μύριζε κοφτερά τη στιγμή που άνοιγε το σακί, και οποιοσδήποτε αρτοποιός θα πετούσε το τσουβάλι. Για να την καταστρέψεις και να αφήσεις το αλεύρι να φαίνεται και να μυρίζει αρκετά υγιές ώστε να το ψήσει τέσσερις φορές, τέσσερις φορές σε καθαρές παρτίδες και με φρέσκια μαγιά, ενώ η ίδια έψαχνε για ένα σφάλμα που ποτέ δεν βρισκόταν στα χέρια της, χρειαζόταν να γνωρίζεις την ακριβώς λάθος δόση. Αυτή ήταν επαγγελματική γνώση, όχι η οργή μιας γειτόνισσας. Ήταν του ίδιου φυράματος με τη δακτυλογραφημένη καταγγελία που παρέθετε τις υποπαραγράφους, με το χέρι που ήξερε απ’ έξω κι ανακατωτά τον κώδικα για τον νιπτήρα. Η ίδια γνώση, τώρα για δεύτερη φορά, σε δύο διαφορετικά όπλα.</w:t>
+        <w:t xml:space="preserve">Δεν μπορούσες να αγοράσεις μια ξινή βάση με το σακί από το ράφι ενός μπακάλη. Ερχόταν από προμηθευτή αρτοποιών, με ανοιχτό λογαριασμό, σε ανθρώπους γνωστούς στον χώρο. Ούτε μπορούσες να τη δοσολογήσεις με το μάτι. Μια πρέζα λιγότερο και δεν έπιανε. Μια φτυαριά παραπάνω και το ωμό αλεύρι μύριζε κοφτερά τη στιγμή που άνοιγε το σακί, και οποιοσδήποτε αρτοποιός θα πετούσε το τσουβάλι. Για να την καταστρέψεις και να αφήσεις το αλεύρι να φαίνεται και να μυρίζει αρκετά υγιές ώστε να το ψήσει τέσσερις φορές, τέσσερις φορές σε καθαρές παρτίδες και με φρέσκια μαγιά, ενώ η ίδια έψαχνε για ένα σφάλμα που ποτέ δεν βρισκόταν στα χέρια της, χρειαζόταν να γνωρίζεις την ακριβώς λάθος δόση. Αυτή ήταν επαγγελματική γνώση, όχι η οργή ενός γείτονα. Ήταν του ίδιου φυράματος με τη δακτυλογραφημένη καταγγελία που παρέθετε τις υποπαραγράφους, με το χέρι που ήξερε απ’ έξω κι ανακατωτά τον κώδικα για τον νιπτήρα. Η ίδια γνώση, τώρα για δεύτερη φορά, σε δύο διαφορετικά όπλα.</w:t>
       </w:r>
     </w:p>
     <w:p>
@@ -3139,7 +3139,7 @@
     <w:p/>
     <w:p>
       <w:r>
-        <w:t xml:space="preserve">Ο Πιτ Γκαρσία είχε τη ράμπα, και είκοσι χειμώνες ξεφορτώματος εκεί, όπου καμία ψυχή στο Φροστ Φολς δεν θα έριχνε δεύτερη ματιά στο βαν του. Είχε κλειδί για την κοινόχρηστη πύλη, δύο μάλιστα τώρα, λαμπερά από το ράφι του Τομ. Είχε την κακία, φωναχτά φορεμένη πάνω του, για αυτή ακριβώς τη ράμπα. Και είχε, σύμφωνα με τα λεγόμενά του, υπάρξει ο μόνος άνθρωπος που είδε μια σιλουέτα στην πίσω πόρτα της Γκρέτας στο σκοτάδι.</w:t>
+        <w:t xml:space="preserve">Ο Πιτ Γκαρσία είχε τη ράμπα, και είκοσι χειμώνες ξεφορτώματος εκεί, όπου καμία ψυχή στο Φροστ Φολς δεν θα έριχνε δεύτερη ματιά στο βαν του. Είχε κλειδί για την κοινόχρηστη πύλη, δύο μάλιστα τώρα, λαμπερά από το ράφι του Τομ. Είχε την κακία, φωναχτά φορεμένη πάνω του, για αυτή ακριβώς τη ράμπα. Και ήταν, σύμφωνα με τα λεγόμενά του, ο μόνος άνθρωπος που είχε δει μια σιλουέτα στην πίσω πόρτα της Γκρέτας στο σκοτάδι.</w:t>
       </w:r>
     </w:p>
     <w:p/>
@@ -3321,7 +3321,7 @@
     <w:p/>
     <w:p>
       <w:r>
-        <w:t xml:space="preserve">Τον βρήκα στον πάγκο του, καθώς το μαγαζί δεν είχε ανοίξει ακόμα, να κόβει το πρωινό κομμάτι, και ισιώθηκε μόλις χτύπησε το κουδουνάκι και άφησε το μαχαίρι επίπεδο, σε επιφυλακή, όπως είχε κάνει την πρώτη φορά, ένας άντρας μαθημένος να περιμένει ένα πράγμα όταν περνούσε την πόρτα του.</w:t>
+        <w:t xml:space="preserve">Τον βρήκα στον πάγκο του, καθώς το μαγαζί δεν είχε ανοίξει ακόμα, να κόβει το πρωινό κομμάτι, και ισιώθηκε μόλις χτύπησε το κουδουνάκι και άφησε το μαχαίρι επίπεδο, σε επιφυλακή, όπως είχε κάνει την πρώτη φορά, ένας άντρας μαθημένος να περιμένει ένα μόνο πράγμα από όποιον περνούσε την πόρτα του.</w:t>
       </w:r>
     </w:p>
     <w:p/>
@@ -3464,7 +3464,7 @@
     <w:p/>
     <w:p>
       <w:r>
-        <w:t xml:space="preserve">Δεν πήγα πρώτα στο αγόρι. Πήγα στην Γκρέτα, επειδή εκείνη ήταν που τον είχε απολύσει, κι αυτή ήξερε τι «φρούτο» ήταν, ενώ ο κόσμος στον δρόμο ήξερε μόνο τη φήμη.</w:t>
+        <w:t xml:space="preserve">Δεν πήγα πρώτα στο αγόρι. Πήγα στην Γκρέτα, επειδή εκείνη ήταν που τον είχε απολύσει, κι αυτή ήξερε τι λογής παιδί ήταν, ενώ ο κόσμος στον δρόμο ήξερε μόνο τη φήμη.</w:t>
       </w:r>
     </w:p>
     <w:p/>
@@ -4103,7 +4103,7 @@
     </w:p>
     <w:p>
       <w:r>
-        <w:t xml:space="preserve">Είχα αργήσει. Όχι στο αλεύρι, ούτε στο στενό. Αυτά τα είχα διαβάσει όλα σωστά. Άργησα στο μοναδικό πράγμα. Όλη την εβδομάδα την έπαιρνα μέσα στο μυαλό μου και την ξανακατέβαζα, την ώρα που κυνηγούσα το κακό σε ένα πληγωμένο αγόρι, σε έναν πονεμένο χασάπη, σε μια οικογένεια που μέτραγε ξύλα. Επειδή ήταν καινούργια, και ευγενική, και με είχε ταΐσει.</w:t>
+        <w:t xml:space="preserve">Είχα αργήσει. Όχι στο αλεύρι, ούτε στο στενό. Αυτά τα είχα διαβάσει όλα σωστά. Άργησα στο μοναδικό πράγμα. Όλη την εβδομάδα την έπαιρνα μέσα στο μυαλό μου και την ξανακατέβαζα, την ώρα που κυνηγούσα το κακό σε ένα πληγωμένο αγόρι, σε έναν πικραμένο χασάπη, σε μια οικογένεια που μέτραγε ξύλα. Επειδή ήταν καινούργια, και ευγενική, και με είχε ταΐσει.</w:t>
       </w:r>
     </w:p>
     <w:p>
@@ -4164,7 +4164,7 @@
     </w:p>
     <w:p>
       <w:r>
-        <w:t xml:space="preserve">Η ευχαρίστηση πέρασε πίσω από τα μάτια της, γρήγορη, και χάθηκε κάτω από το χαμόγελο. Σε λάθος απόχρωση. Πολύ ικανοποιημένη. Ένα κομμάτι που έπεφτε σε μια εγκοπή που είχε ήδη κόψει γι' αυτό.</w:t>
+        <w:t xml:space="preserve">Η ευχαρίστηση πέρασε πίσω από τα μάτια της, γρήγορη, και χάθηκε κάτω από το χαμόγελο. Σε λάθος απόχρωση. Υπερβολικά ικανοποιημένη. Ένα κομμάτι που έπεφτε σε μια εγκοπή που είχε ήδη κόψει γι' αυτό.</w:t>
       </w:r>
     </w:p>
     <w:p>
@@ -4272,7 +4272,7 @@
     </w:p>
     <w:p>
       <w:r>
-        <w:t xml:space="preserve">Ακολούθησα. Πήραμε τον δρόμο της επιστροφής κατά μήκος της λεωφόρου στο μουντό, επίπεδο πρωινό. Χαμηλά στη γωνία η πρόσοψη του Holly Jolly στεκόταν σκοτεινή, με το κίτρινο χαρτί ακόμα στη βιτρίνα, κλειστή εδώ και πέντε μέρες. Δεν σταμάτησα να την κοιτάξω. Αν στεκόμουν στο πεζοδρόμιο θρηνώντας ένα κλειστό μαγαζί, ο κόσμος θα το σχολίαζε.</w:t>
+        <w:t xml:space="preserve">Ακολούθησα. Πήραμε τον δρόμο της επιστροφής κατά μήκος της λεωφόρου στο μουντό, επίπεδο πρωινό. Χαμηλά, στην κάτω άκρη, η πρόσοψη του Holly Jolly στεκόταν σκοτεινή, με το κίτρινο χαρτί ακόμα στη βιτρίνα, κλειστή εδώ και πέντε μέρες. Δεν σταμάτησα να την κοιτάξω. Αν στεκόμουν στο πεζοδρόμιο θρηνώντας ένα κλειστό μαγαζί, ο κόσμος θα το σχολίαζε.</w:t>
       </w:r>
     </w:p>
     <w:p>
@@ -4533,7 +4533,7 @@
     <w:p/>
     <w:p>
       <w:r>
-        <w:t>Άκουσε χωρίς να γνέφει. Η Πιπ είχε πάει κατευθείαν στο ζεστό κομμάτι του πατώματος δίπλα στη σόμπα του που είχε διεκδικήσει από την Κυριακή, και ξαπλώθηκε εκεί σε όλο της το μήκος, κοιτάζοντας και τους δύο μας.</w:t>
+        <w:t xml:space="preserve">Άκουσε χωρίς να γνέφει. Η Πιπ είχε πάει κατευθείαν στο ζεστό κομμάτι του πατώματος δίπλα στη σόμπα του που είχε διεκδικήσει την Κυριακή, και ξαπλώθηκε εκεί σε όλο της το μήκος, κοιτάζοντας και τους δύο μας.</w:t>
       </w:r>
     </w:p>
     <w:p/>
@@ -4665,7 +4665,7 @@
     <w:p/>
     <w:p>
       <w:r>
-        <w:t>Κοίταξε τις γυναίκες δίπλα στη βιτρίνα, που διάλεγαν τάρτες. Έπειτα είπε μια κουβέντα στην υπάλληλό της να προσέχει το μπροστινό μέρος, και μας άνοιξε την αψίδα.</w:t>
+        <w:t xml:space="preserve">Κοίταξε τις γυναίκες δίπλα στη βιτρίνα, που διάλεγαν τάρτες. Έπειτα είπε μια κουβέντα στην υπάλληλό της να προσέχει το μπροστινό μέρος, και μας οδήγησε μέσα από την αψίδα.</w:t>
       </w:r>
     </w:p>
     <w:p/>
@@ -4857,7 +4857,7 @@
     <w:p/>
     <w:p>
       <w:r>
-        <w:t xml:space="preserve">«Φαντάζομαι πως θα φέρετε παρ’ όλα αυτά το στεφάνι», είπε. «Έλατο και χρυσός φιόγκος». Μας κράτησε την καμάρα όπως και στην είσοδο.</w:t>
+        <w:t xml:space="preserve">«Φαντάζομαι πως θα φέρετε παρ’ όλα αυτά το στεφάνι», είπε. «Έλατο και χρυσός φιόγκος». Μας οδήγησε έξω από την καμάρα, όπως μας είχε οδηγήσει και μέσα.</w:t>
       </w:r>
     </w:p>
     <w:p/>
@@ -5066,7 +5066,7 @@
     <w:p/>
     <w:p>
       <w:r>
-        <w:t>Και δεν άντεχε.</w:t>
+        <w:t xml:space="preserve">Και δεν άντεξε.</w:t>
       </w:r>
     </w:p>
     <w:p/>
@@ -5114,7 +5114,7 @@
     <w:p/>
     <w:p>
       <w:r>
-        <w:t xml:space="preserve">Το καλό κλίμα του εράνου, το κέδρινο κουτί να γεμίζει στο Γκρέιντζ και τη φράση της ιδρύτριας σε κάθε βιτρίνα και τις προσεκτικές γυναίκες να λένε ότι θα ήταν ντροπή και κρίμα. Δεν εξαφανίστηκε. Δεν ήταν τόσο φθηνό. Αλλά υποχώρησε. Το είδα να υποχωρεί στο δωμάτιο, είδα την ελπίδα να γίνεται πιο δύσκολο να κρατηθεί σε ανθρώπους που είχαν αφήσει τους εαυτούς τους να πιστέψουν ότι η Εταιρεία ήταν σχεδόν σωσμένη επειδή ήθελαν να σωθεί. Σκέφτηκα τον κύριο Γουόρτινγκτον, τον παλαιότερο ευεργέτη της Εταιρείας, ο οποίος μου είχε πει εβδομάδες πριν ότι θα έγραφε ολόκληρο το ποσό σε μια επιταγή αν έφταναν σε αυτό το σημείο. Του είχα ζητήσει να το κρατήσει στην άκρη, και το είχα αφήσει εκεί. Η πόλη έπρεπε να κάνει την πρώτη κίνηση.</w:t>
+        <w:t xml:space="preserve">Το καλό κλίμα του εράνου, το κέδρινο κουτί να γεμίζει στο Γκρέιντζ και τη φράση της ιδρύτριας σε κάθε βιτρίνα και τις προσεκτικές γυναίκες να λένε ότι θα ήταν ντροπή και κρίμα. Δεν εξαφανίστηκε. Δεν ήταν τόσο φθηνό. Αλλά υποχώρησε. Το είδα να υποχωρεί στο δωμάτιο, είδα την ελπίδα να γίνεται πιο δύσκολο να κρατηθεί σε ανθρώπους που είχαν αφήσει τους εαυτούς τους να πιστέψουν ότι η Εταιρεία ήταν σχεδόν σωσμένη επειδή ήθελαν να σωθεί. Σκέφτηκα τον κύριο Γουόρτινγκτον, τον παλαιότερο ευεργέτη της Εταιρείας, ο οποίος μου είχε πει εβδομάδες πριν ότι θα έγραφε ολόκληρο το ποσό σε μια επιταγή αν έφταναν σε αυτό το σημείο. Του είχα ζητήσει να το κρατήσει στην άκρη, και το άφησα εκεί. Η πόλη έπρεπε να κάνει την πρώτη κίνηση.</w:t>
       </w:r>
     </w:p>
     <w:p/>
@@ -5393,7 +5393,7 @@
     </w:p>
     <w:p>
       <w:r>
-        <w:t xml:space="preserve">Πήρα μια κόρα από τη σανίδα του ψωμιού και την έβαλα ακριβώς μετά το πιπέρι, στην άκρη-άκρη του κουταλιού, εκεί που το στενό έβγαινε σε ανοιχτό χώρο.</w:t>
+        <w:t xml:space="preserve">Πήρα μια κόρα από τη σανίδα του ψωμιού και την έβαλα ακριβώς μετά την πιπεριέρα, στην άκρη-άκρη του κουταλιού, εκεί που το στενό έβγαινε σε ανοιχτό χώρο.</w:t>
       </w:r>
     </w:p>
     <w:p>
@@ -5443,7 +5443,7 @@
     </w:p>
     <w:p>
       <w:r>
-        <w:t xml:space="preserve">Ο Νικ γύρισε πίσω στην καρέκλα του και κοίταξε τα δύο δοχεία δίπλα δίπλα. «Άρα το κλείσιμο χρονομετρήθηκε σύμφωνα με τα εγκαίνια».</w:t>
+        <w:t xml:space="preserve">Ο Νικ έγειρε πίσω στην καρέκλα του και κοίταξε τα δύο δοχεία δίπλα δίπλα. «Άρα το κλείσιμο χρονομετρήθηκε σύμφωνα με τα εγκαίνια».</w:t>
       </w:r>
     </w:p>
     <w:p>
@@ -5513,7 +5513,7 @@
     <w:p/>
     <w:p>
       <w:r>
-        <w:t xml:space="preserve">Η Πιπ είχε έρθει να σταθεί στο γόνατο της Μάρθας. Τέντωσε τον λαιμό της και χτύπησε την αναμμένη οθόνη με το ράμφος της, δύο φορές, μέχρι που η οθόνη μαύρισε. Μετά τράβηξε το κεφάλι της πίσω και την κοίταξε με βαθιά καχυποψία.</w:t>
+        <w:t xml:space="preserve">Η Πιπ είχε έρθει να σταθεί δίπλα στο γόνατο της Μάρθας. Τέντωσε τον λαιμό της και χτύπησε την αναμμένη οθόνη με το ράμφος της, δύο φορές, μέχρι που η οθόνη μαύρισε. Μετά τράβηξε το κεφάλι της πίσω και την κοίταξε με βαθιά καχυποψία.</w:t>
       </w:r>
     </w:p>
     <w:p/>
@@ -5916,7 +5916,7 @@
     </w:p>
     <w:p>
       <w:r>
-        <w:t>«Σε κρατάω υπεύθυνη και για τα δύο». Τράβηξε τον υπολογιστή κοντά της. «Εντάξει. Κάθε εταιρεία πρέπει να είναι εγγεγραμμένη σε κάποια πολιτεία, και ο καθένας μπορεί να τις ψάξει. Η μισή μου δουλειά είναι αυτή η οθόνη. Ποιο είναι το όνομα;»</w:t>
+        <w:t xml:space="preserve">«Θα σε κρατήσω στον λόγο σου, και για τα δύο». Τράβηξε τον υπολογιστή κοντά της. «Εντάξει. Κάθε εταιρεία πρέπει να είναι εγγεγραμμένη σε κάποια πολιτεία, και ο καθένας μπορεί να τις ψάξει. Η μισή μου δουλειά είναι αυτή η οθόνη. Ποιο είναι το όνομα;»</w:t>
       </w:r>
     </w:p>
     <w:p>
@@ -6444,7 +6444,7 @@
     </w:p>
     <w:p>
       <w:r>
-        <w:t xml:space="preserve">«Δούλευα στον διπλανό πάγκο από αυτή τη γυναίκα δεκαπέντε χρόνια». Η Γκρέτα πήρε το χέρι της από τη σελίδα. «Σκούπισε τα σπασμένα τζάμια μου από το πάτωμα. Μου έφερε ένα φαγητό στον φούρνο, κι εγώ το έφαγα». Η φωνή της δεν ανέβηκε. «Θέλω να την κοιτάξω».</w:t>
+        <w:t xml:space="preserve">«Δούλευα στον πάγκο δίπλα σε αυτή τη γυναίκα δεκαπέντε χρόνια». Η Γκρέτα πήρε το χέρι της από τη σελίδα. «Σκούπισε τα σπασμένα τζάμια μου από το πάτωμα. Μου έφερε ένα φαγητό στον φούρνο, κι εγώ το έφαγα». Η φωνή της δεν ανέβηκε. «Θέλω να την κοιτάξω».</w:t>
       </w:r>
     </w:p>
     <w:p>
@@ -6510,7 +6510,7 @@
     <w:p/>
     <w:p>
       <w:r>
-        <w:t xml:space="preserve">Η αρχηγός Τανάκα είχε ετοιμάσει μόνη της το δωμάτιο —όχι το μπροστινό γραφείο με τον πάγκο, αλλά το ήσυχο δωμάτιο πίσω από αυτό, με ένα απλό τραπέζι και καλές καρέκλες. Ο χτυπημένος βραστήρας είχε μεταφερθεί από μέσα και είχε μπει να βράζει στη γωνία, ώστε ο αέρας να είναι γεμάτος ατμό. Η Τανάκα κάθισε στην κεφαλή με το φθαρμένο της τετράδιο ανοιχτό μπροστά της και έναν καφέ φάκελο από κάτω. Η Γκρέτα κάθισε δίπλα μου, στητή μέσα στο καλό της παλτό. Είχε έρθει για να δει την Τζόις, και την κοιτούσε. Η Πιπ στεκόταν ακουμπισμένη στην μπότα μου κάτω από το τραπέζι, επειδή δεν είχα ζητήσει άδεια να φέρω το πτηνό και κανείς δεν είχε σκεφτεί να την αρνηθεί.</w:t>
+        <w:t xml:space="preserve">Η αρχηγός Τανάκα είχε ετοιμάσει μόνη της το δωμάτιο —όχι το μπροστινό γραφείο με τον πάγκο, αλλά το ήσυχο δωμάτιο πίσω από αυτό, με ένα απλό τραπέζι και καλές καρέκλες. Ο χτυπημένος βραστήρας είχε μεταφερθεί από μέσα και είχε μπει να βράζει στη γωνία, ώστε ο αέρας να είναι γεμάτος ατμό. Η Τανάκα κάθισε στην κεφαλή με το φθαρμένο της τετράδιο ανοιχτό μπροστά της και έναν καφέ φάκελο από κάτω. Η Γκρέτα κάθισε δίπλα μου, στητή μέσα στο καλό της παλτό. Είχε έρθει για να δει την Τζόις, και την κοιτούσε. Η Πιπ στεκόταν ακουμπισμένη στην μπότα μου κάτω από το τραπέζι, επειδή δεν είχα ζητήσει άδεια να φέρω το πτηνό και κανείς δεν είχε σκεφτεί να τη διώξει.</w:t>
       </w:r>
     </w:p>
     <w:p/>
@@ -6599,7 +6599,7 @@
     <w:p/>
     <w:p>
       <w:r>
-        <w:t xml:space="preserve">«Φυσικά», είπε η Τζόις, και κάθισε πίσω στην καρέκλα της, προσεκτική, σαν γυναίκα σε μια συνάντηση όπου χαιρόταν που την είχαν καλέσει.</w:t>
+        <w:t xml:space="preserve">«Φυσικά», είπε η Τζόις, και έγειρε πίσω στην καρέκλα της, προσεκτική, σαν γυναίκα σε μια συνάντηση όπου χαιρόταν που την είχαν καλέσει.</w:t>
       </w:r>
     </w:p>
     <w:p/>
@@ -6726,7 +6726,7 @@
     <w:p/>
     <w:p>
       <w:r>
-        <w:t xml:space="preserve">«Είκοσι πέντε χρόνια», είπε στην Γκρέτα. «Δεν το άλλαξες ποτέ. Θεέ μου, Γκρετ».</w:t>
+        <w:t xml:space="preserve">«Είκοσι πέντε χρόνια», είπε στην Γκρέτα. «Δεν άλλαξες ποτέ το λουκέτο. Θεέ μου, Γκρετ».</w:t>
       </w:r>
     </w:p>
     <w:p/>
@@ -7239,7 +7239,7 @@
     </w:p>
     <w:p>
       <w:r>
-        <w:t>Μου έριξε μια κούπα και με άφησε να βολευτώ στην άκρη της εστίας με τα δύο μου χέρια τυλιγμένα γύρω της προτού πει οτιδήποτε.</w:t>
+        <w:t xml:space="preserve">Μου έβαλε μια κούπα τσάι και με άφησε να βολευτώ στην άκρη της εστίας με τα δύο μου χέρια τυλιγμένα γύρω της προτού πει οτιδήποτε.</w:t>
       </w:r>
     </w:p>
     <w:p>
@@ -7320,7 +7320,7 @@
     </w:p>
     <w:p>
       <w:r>
-        <w:t>Κανείς δεν χρειαζόταν να του το διαβάσουν δεύτερη φορά.</w:t>
+        <w:t xml:space="preserve">Κανείς δεν χρειάστηκε να το ακούσει δεύτερη φορά.</w:t>
       </w:r>
     </w:p>
     <w:p>
@@ -7490,7 +7490,7 @@
     </w:p>
     <w:p>
       <w:r>
-        <w:t xml:space="preserve">Στεκόταν στη βάση των μπροστινών σκαλιών με μια καινούργια κόλλα με στήλες στο πρόχειρό του, με στήλες γραμμένες με τα μικρά, τετραγωνισμένα γράμματά του: ποιος έφερε ξυλεία ή φορτηγό, και ποιος μόνο τα δύο του χέρια και ένα θερμός. Τσέκαρε κάθε γραμμή καθώς έφτανε. Ανεβήκαμε στη λεωφόρο όπως κάναμε και για τα βαρέλια του Χαλ, μόνο που τώρα κουβαλούσαμε δοκάρια αντί για κονσέρβες.</w:t>
+        <w:t xml:space="preserve">Στεκόταν στη βάση των μπροστινών σκαλιών με μια καινούργια κόλλα στο πρόχειρό του, με στήλες γραμμένες με τα μικρά, τετραγωνισμένα γράμματά του: ποιος έφερε ξυλεία ή φορτηγό, και ποιος μόνο τα δύο του χέρια και ένα θερμός. Τσέκαρε κάθε γραμμή καθώς έφτανε. Ανεβήκαμε στη λεωφόρο όπως κάναμε και για τα βαρέλια του Χαλ, μόνο που τώρα κουβαλούσαμε δοκάρια αντί για κονσέρβες.</w:t>
       </w:r>
     </w:p>
     <w:p>
@@ -7687,7 +7687,7 @@
     </w:p>
     <w:p>
       <w:r>
-        <w:t xml:space="preserve">Η Μάρθα άφησε μια τούφα από το μαλλί που είχε βάψει εκείνη τη χρονιά. «Δεν πρόκειται να πετύχω ποτέ ξανά αυτό το κόκκινο», είπε, και ακούμπησε τα χέρια της πάνω στο κουτί για μια στιγμή πριν απομακρυνθεί.</w:t>
+        <w:t xml:space="preserve">Η Μάρθα άφησε μια κούκλα από το μαλλί που είχε βάψει εκείνη τη χρονιά. «Δεν πρόκειται να πετύχω ποτέ ξανά αυτό το κόκκινο», είπε, και ακούμπησε τα χέρια της πάνω στο κουτί για μια στιγμή πριν απομακρυνθεί.</w:t>
       </w:r>
     </w:p>
     <w:p>
@@ -7732,7 +7732,7 @@
     </w:p>
     <w:p>
       <w:r>
-        <w:t xml:space="preserve">Έβαλε μέσα στο κουτί ένα και μοναδικό ορειχάλκινο καρφάκι, από αυτές με τις οποίες μπάλωνε τα αρχεία όλο τον μήνα. «Δεν είναι και πολλά», είπε χαμηλόφωνα, περισσότερο στην Τανάκα παρά στην αίθουσα. «Αλλά σε εκατό χρόνια κάποιος θα κρατάει το κτίριο της Εταιρείας ενωμένο με τα ίδια μικρά κομμάτια. Θα ήθελα να ξέρουν ότι κάποιος από εμάς το έκανε τώρα». Γύρισε πίσω στον τοίχο, εκεί όπου ένιωθε πιο άνετα.</w:t>
+        <w:t xml:space="preserve">Έβαλε μέσα στο κουτί ένα και μοναδικό ορειχάλκινο καρφάκι, από αυτά με τα οποία μπάλωνε τα αρχεία όλο τον μήνα. «Δεν είναι και πολλά», είπε χαμηλόφωνα, περισσότερο στην Τανάκα παρά στην αίθουσα. «Αλλά σε εκατό χρόνια κάποιος θα κρατάει το κτίριο της Εταιρείας ενωμένο με τα ίδια μικρά κομμάτια. Θα ήθελα να ξέρουν ότι κάποιος από εμάς το έκανε τώρα». Γύρισε πίσω στον τοίχο, εκεί όπου ένιωθε πιο άνετα.</w:t>
       </w:r>
     </w:p>
     <w:p>
@@ -8036,7 +8036,7 @@
     <w:p/>
     <w:p>
       <w:r>
-        <w:t xml:space="preserve">«Κυρία Κλος! Η Πιπ έπιασε έναν κλέφτη», ανακοίνωσε η Έμα, λαχανιασμένη, σαν να μην ήμουν κι εγώ εκεί. «Αληθινό. Η κυρία Μπένετ το έγραψε στην εφημερίδα και ο μπαμπάς μου μού το διάβασε δύο φορές».</w:t>
+        <w:t xml:space="preserve">«Κυρία Κλος! Η Πιπ έπιασε έναν κλέφτη», ανακοίνωσε η Έμα, λαχανιασμένη, σαν να μην ήμουν κι εγώ εκεί. «Αληθινό κλέφτη. Η κυρία Μπένετ το έγραψε στην εφημερίδα και ο μπαμπάς μου μού το διάβασε δύο φορές».</w:t>
       </w:r>
     </w:p>
     <w:p/>

</xml_diff>